<commit_message>
Update report PPT and development records
</commit_message>
<xml_diff>
--- a/deliverables/课程报告-校园车辆与车牌检测系统.docx
+++ b/deliverables/课程报告-校园车辆与车牌检测系统.docx
@@ -8,12 +8,12 @@
       </w:pPr>
       <w:r>
         <w:rPr>
-          <w:rFonts w:ascii="Arial" w:hAnsi="Arial"/>
+          <w:rFonts w:ascii="Microsoft YaHei" w:hAnsi="Microsoft YaHei" w:eastAsia="Microsoft YaHei"/>
           <w:b/>
-          <w:color w:val="0B2545"/>
-          <w:sz w:val="40"/>
+          <w:color w:val="0F172A"/>
+          <w:sz w:val="42"/>
         </w:rPr>
-        <w:t>基于 YOLO 的校园车辆与车牌检测系统设计与实现</w:t>
+        <w:t>企业车牌识别与车辆管理系统设计与实现</w:t>
       </w:r>
     </w:p>
     <w:p>
@@ -22,12 +22,11 @@
       </w:pPr>
       <w:r>
         <w:rPr>
-          <w:rFonts w:ascii="Arial" w:hAnsi="Arial"/>
-          <w:b w:val="0"/>
-          <w:color w:val="505A69"/>
-          <w:sz w:val="24"/>
+          <w:rFonts w:ascii="Microsoft YaHei" w:hAnsi="Microsoft YaHei" w:eastAsia="Microsoft YaHei"/>
+          <w:color w:val="64748B"/>
+          <w:sz w:val="22"/>
         </w:rPr>
-        <w:t>创新应用综合实训课程报告</w:t>
+        <w:t>P402019B 创新应用综合实训 · 课程报告</w:t>
       </w:r>
     </w:p>
     <w:p>
@@ -35,26 +34,20 @@
         <w:pStyle w:val="Heading1"/>
       </w:pPr>
       <w:r>
-        <w:rPr>
-          <w:rFonts w:ascii="Arial" w:hAnsi="Arial"/>
-          <w:b/>
-          <w:color w:val="2E74B5"/>
-          <w:sz w:val="32"/>
-        </w:rPr>
         <w:t>项目简要介绍</w:t>
       </w:r>
     </w:p>
     <w:p>
       <w:pPr>
-        <w:spacing w:after="120" w:line="276" w:lineRule="auto"/>
+        <w:spacing w:line="283" w:lineRule="auto" w:after="120"/>
       </w:pPr>
       <w:r>
         <w:rPr>
-          <w:rFonts w:ascii="Arial" w:hAnsi="Arial"/>
+          <w:rFonts w:ascii="Microsoft YaHei" w:hAnsi="Microsoft YaHei" w:eastAsia="Microsoft YaHei"/>
           <w:b w:val="0"/>
-          <w:sz w:val="22"/>
+          <w:sz w:val="21"/>
         </w:rPr>
-        <w:t>本项目面向校园车辆管理与门禁辅助识别场景，设计并实现了一个车辆与车牌检测系统。系统支持图片上传、目标检测、检测框可视化、数量统计和车牌区域裁剪，形成了从模型训练到应用展示的完整流程。项目融合 PyTorch 轻量 YOLO 风格检测模型与 OpenCV 图像处理方法，并提供非静态网页系统和静态 HTML 演示页面。最终模型基于 25554 张图像训练，能够在测试集上完成车牌区域检测并输出可视化结果。</w:t>
+        <w:t>本项目面向校园/企业门岗车辆管理场景，完成了一个从车辆图片上传、车牌检测、OCR 识别到车辆档案查询的视觉 AI 应用系统。系统基于公开车牌检测数据集训练轻量 YOLO 风格检测模型，并结合 Flask、OpenCV 和前端管理界面形成可演示的完整闭环。项目亮点是将普通车牌检测 Demo 升级为更接近真实业务的车辆管理系统：识别车牌后可自动查找车辆档案，显示车主部门、通行权限、车辆状态和返回车辆图片。最终材料包含源代码、模型、运行截图、课程报告、陈述 PPT、开发日志和沟通记录，原始大数据集不随提交包上传，仅在报告中注明来源。</w:t>
       </w:r>
     </w:p>
     <w:p>
@@ -62,220 +55,144 @@
         <w:pStyle w:val="Heading1"/>
       </w:pPr>
       <w:r>
-        <w:rPr>
-          <w:rFonts w:ascii="Arial" w:hAnsi="Arial"/>
-          <w:b/>
-          <w:color w:val="2E74B5"/>
-          <w:sz w:val="32"/>
-        </w:rPr>
         <w:t>成员工作描述及组内量化贡献比</w:t>
       </w:r>
     </w:p>
     <w:p>
       <w:pPr>
-        <w:spacing w:after="120" w:line="276" w:lineRule="auto"/>
+        <w:spacing w:line="283" w:lineRule="auto" w:after="120"/>
       </w:pPr>
       <w:r>
         <w:rPr>
-          <w:rFonts w:ascii="Arial" w:hAnsi="Arial"/>
+          <w:rFonts w:ascii="Microsoft YaHei" w:hAnsi="Microsoft YaHei" w:eastAsia="Microsoft YaHei"/>
           <w:b w:val="0"/>
-          <w:sz w:val="22"/>
+          <w:sz w:val="21"/>
         </w:rPr>
-        <w:t>成员A负责项目选题、需求分析、报告撰写与整体材料整理；成员B负责数据集整理、模型训练脚本、训练参数调整与测试结果分析；成员C负责 Flask 后端、检测接口和 OpenCV 可视化模块；成员D负责前端页面、静态演示版、PPT 制作和演示视频准备。成员A：成员B：成员C：成员D = 2.5：3.0：2.5：2.0。</w:t>
-      </w:r>
-    </w:p>
-    <w:p>
-      <w:pPr>
-        <w:pStyle w:val="Heading1"/>
-      </w:pPr>
-      <w:r>
-        <w:rPr>
-          <w:rFonts w:ascii="Arial" w:hAnsi="Arial"/>
-          <w:b/>
-          <w:color w:val="2E74B5"/>
-          <w:sz w:val="32"/>
-        </w:rPr>
-        <w:t>一、项目背景与意义</w:t>
-      </w:r>
-    </w:p>
-    <w:p>
-      <w:pPr>
-        <w:spacing w:after="120" w:line="276" w:lineRule="auto"/>
-      </w:pPr>
-      <w:r>
-        <w:rPr>
-          <w:rFonts w:ascii="Arial" w:hAnsi="Arial"/>
-          <w:b w:val="0"/>
-          <w:sz w:val="22"/>
-        </w:rPr>
-        <w:t>校园门口、停车场和道路区域经常需要对车辆通行情况进行记录与统计。传统人工查看监控画面的方式效率较低，也不利于后续数据分析。目标检测技术可以自动定位图片中的车辆和车牌区域，为车辆管理、通行统计和安防辅助提供技术基础。</w:t>
-      </w:r>
-    </w:p>
-    <w:p>
-      <w:pPr>
-        <w:pStyle w:val="Heading1"/>
-      </w:pPr>
-      <w:r>
-        <w:rPr>
-          <w:rFonts w:ascii="Arial" w:hAnsi="Arial"/>
-          <w:b/>
-          <w:color w:val="2E74B5"/>
-          <w:sz w:val="32"/>
-        </w:rPr>
-        <w:t>二、需求分析</w:t>
-      </w:r>
-    </w:p>
-    <w:p>
-      <w:pPr>
-        <w:pStyle w:val="ListBullet"/>
-        <w:spacing w:after="80"/>
-      </w:pPr>
-      <w:r>
-        <w:rPr>
-          <w:rFonts w:ascii="Arial" w:hAnsi="Arial"/>
-          <w:b w:val="0"/>
-          <w:sz w:val="22"/>
-        </w:rPr>
-        <w:t>支持上传车辆图片，并在页面中展示原图和检测结果图。</w:t>
-      </w:r>
-    </w:p>
-    <w:p>
-      <w:pPr>
-        <w:pStyle w:val="ListBullet"/>
-        <w:spacing w:after="80"/>
-      </w:pPr>
-      <w:r>
-        <w:rPr>
-          <w:rFonts w:ascii="Arial" w:hAnsi="Arial"/>
-          <w:b w:val="0"/>
-          <w:sz w:val="22"/>
-        </w:rPr>
-        <w:t>能够检测车辆区域和车牌区域，并显示类别、置信度和坐标。</w:t>
-      </w:r>
-    </w:p>
-    <w:p>
-      <w:pPr>
-        <w:pStyle w:val="ListBullet"/>
-        <w:spacing w:after="80"/>
-      </w:pPr>
-      <w:r>
-        <w:rPr>
-          <w:rFonts w:ascii="Arial" w:hAnsi="Arial"/>
-          <w:b w:val="0"/>
-          <w:sz w:val="22"/>
-        </w:rPr>
-        <w:t>能够统计车辆数量、车牌数量和平均置信度。</w:t>
-      </w:r>
-    </w:p>
-    <w:p>
-      <w:pPr>
-        <w:pStyle w:val="ListBullet"/>
-        <w:spacing w:after="80"/>
-      </w:pPr>
-      <w:r>
-        <w:rPr>
-          <w:rFonts w:ascii="Arial" w:hAnsi="Arial"/>
-          <w:b w:val="0"/>
-          <w:sz w:val="22"/>
-        </w:rPr>
-        <w:t>能够裁剪车牌区域，便于课程报告和演示视频展示。</w:t>
-      </w:r>
-    </w:p>
-    <w:p>
-      <w:pPr>
-        <w:pStyle w:val="ListBullet"/>
-        <w:spacing w:after="80"/>
-      </w:pPr>
-      <w:r>
-        <w:rPr>
-          <w:rFonts w:ascii="Arial" w:hAnsi="Arial"/>
-          <w:b w:val="0"/>
-          <w:sz w:val="22"/>
-        </w:rPr>
-        <w:t>提供非静态版和静态版两套入口，降低答辩展示风险。</w:t>
-      </w:r>
-    </w:p>
-    <w:p>
-      <w:pPr>
-        <w:pStyle w:val="Heading1"/>
-      </w:pPr>
-      <w:r>
-        <w:rPr>
-          <w:rFonts w:ascii="Arial" w:hAnsi="Arial"/>
-          <w:b/>
-          <w:color w:val="2E74B5"/>
-          <w:sz w:val="32"/>
-        </w:rPr>
-        <w:t>三、数据集与数据处理</w:t>
-      </w:r>
-    </w:p>
-    <w:p>
-      <w:pPr>
-        <w:spacing w:after="120" w:line="276" w:lineRule="auto"/>
-      </w:pPr>
-      <w:r>
-        <w:rPr>
-          <w:rFonts w:ascii="Arial" w:hAnsi="Arial"/>
-          <w:b w:val="0"/>
-          <w:sz w:val="22"/>
-        </w:rPr>
-        <w:t>项目合并了三个公开车牌检测数据来源，均采用 YOLO 标注或可按 YOLO 目录结构读取。合并脚本会自动识别 train、valid、test 三个划分，并将图片与标签复制到统一目录。</w:t>
+        <w:t>胡哲祺负责项目总体设计、选题把关、进度统筹、报告统稿、训练结果验收和答辩组织；温豪杰负责数据集整理、标注格式检查、训练脚本实现、模型训练和实验结果分析；杨大松负责 Flask 后端接口、OpenCV 检测结果可视化、OCR 与车辆档案匹配、企业管理系统前端和运行截图整理。胡哲祺：温豪杰：杨大松 = 4：3：3。</w:t>
       </w:r>
     </w:p>
     <w:tbl>
       <w:tblPr>
         <w:tblStyle w:val="TableGrid"/>
         <w:tblW w:type="auto" w:w="0"/>
+        <w:jc w:val="center"/>
         <w:tblLook w:firstColumn="1" w:firstRow="1" w:lastColumn="0" w:lastRow="0" w:noHBand="0" w:noVBand="1" w:val="04A0"/>
       </w:tblPr>
       <w:tblGrid>
-        <w:gridCol w:w="3120"/>
-        <w:gridCol w:w="3120"/>
-        <w:gridCol w:w="3120"/>
+        <w:gridCol w:w="2016"/>
+        <w:gridCol w:w="2016"/>
+        <w:gridCol w:w="2016"/>
+        <w:gridCol w:w="2016"/>
+        <w:gridCol w:w="2016"/>
       </w:tblGrid>
       <w:tr>
         <w:tc>
           <w:tcPr>
-            <w:tcW w:type="dxa" w:w="3120"/>
+            <w:tcW w:type="dxa" w:w="1224"/>
+            <w:shd w:fill="DBEAFE"/>
+            <w:vAlign w:val="center"/>
           </w:tcPr>
           <w:p>
+            <w:pPr>
+              <w:spacing w:after="0"/>
+            </w:pPr>
+            <w:r/>
             <w:r>
               <w:rPr>
-                <w:rFonts w:ascii="Arial" w:hAnsi="Arial"/>
+                <w:rFonts w:ascii="Microsoft YaHei" w:hAnsi="Microsoft YaHei" w:eastAsia="Microsoft YaHei"/>
                 <w:b/>
-                <w:sz w:val="22"/>
+                <w:color w:val="1E40AF"/>
+                <w:sz w:val="18"/>
               </w:rPr>
-              <w:t>数据来源</w:t>
+              <w:t>姓名</w:t>
             </w:r>
           </w:p>
         </w:tc>
         <w:tc>
           <w:tcPr>
-            <w:tcW w:type="dxa" w:w="3120"/>
+            <w:tcW w:type="dxa" w:w="1512"/>
+            <w:shd w:fill="DBEAFE"/>
+            <w:vAlign w:val="center"/>
           </w:tcPr>
           <w:p>
+            <w:pPr>
+              <w:spacing w:after="0"/>
+            </w:pPr>
+            <w:r/>
             <w:r>
               <w:rPr>
-                <w:rFonts w:ascii="Arial" w:hAnsi="Arial"/>
+                <w:rFonts w:ascii="Microsoft YaHei" w:hAnsi="Microsoft YaHei" w:eastAsia="Microsoft YaHei"/>
                 <w:b/>
-                <w:sz w:val="22"/>
+                <w:color w:val="1E40AF"/>
+                <w:sz w:val="18"/>
               </w:rPr>
-              <w:t>说明</w:t>
+              <w:t>学号</w:t>
             </w:r>
           </w:p>
         </w:tc>
         <w:tc>
           <w:tcPr>
-            <w:tcW w:type="dxa" w:w="3120"/>
+            <w:tcW w:type="dxa" w:w="1008"/>
+            <w:shd w:fill="DBEAFE"/>
+            <w:vAlign w:val="center"/>
           </w:tcPr>
           <w:p>
+            <w:pPr>
+              <w:spacing w:after="0"/>
+            </w:pPr>
+            <w:r/>
             <w:r>
               <w:rPr>
-                <w:rFonts w:ascii="Arial" w:hAnsi="Arial"/>
+                <w:rFonts w:ascii="Microsoft YaHei" w:hAnsi="Microsoft YaHei" w:eastAsia="Microsoft YaHei"/>
                 <w:b/>
-                <w:sz w:val="22"/>
+                <w:color w:val="1E40AF"/>
+                <w:sz w:val="18"/>
               </w:rPr>
-              <w:t>数量</w:t>
+              <w:t>角色</w:t>
+            </w:r>
+          </w:p>
+        </w:tc>
+        <w:tc>
+          <w:tcPr>
+            <w:tcW w:type="dxa" w:w="5328"/>
+            <w:shd w:fill="DBEAFE"/>
+            <w:vAlign w:val="center"/>
+          </w:tcPr>
+          <w:p>
+            <w:pPr>
+              <w:spacing w:after="0"/>
+            </w:pPr>
+            <w:r/>
+            <w:r>
+              <w:rPr>
+                <w:rFonts w:ascii="Microsoft YaHei" w:hAnsi="Microsoft YaHei" w:eastAsia="Microsoft YaHei"/>
+                <w:b/>
+                <w:color w:val="1E40AF"/>
+                <w:sz w:val="18"/>
+              </w:rPr>
+              <w:t>主要工作</w:t>
+            </w:r>
+          </w:p>
+        </w:tc>
+        <w:tc>
+          <w:tcPr>
+            <w:tcW w:type="dxa" w:w="1008"/>
+            <w:shd w:fill="DBEAFE"/>
+            <w:vAlign w:val="center"/>
+          </w:tcPr>
+          <w:p>
+            <w:pPr>
+              <w:spacing w:after="0"/>
+            </w:pPr>
+            <w:r/>
+            <w:r>
+              <w:rPr>
+                <w:rFonts w:ascii="Microsoft YaHei" w:hAnsi="Microsoft YaHei" w:eastAsia="Microsoft YaHei"/>
+                <w:b/>
+                <w:color w:val="1E40AF"/>
+                <w:sz w:val="18"/>
+              </w:rPr>
+              <w:t>贡献比</w:t>
             </w:r>
           </w:p>
         </w:tc>
@@ -283,46 +200,101 @@
       <w:tr>
         <w:tc>
           <w:tcPr>
-            <w:tcW w:type="dxa" w:w="3120"/>
+            <w:tcW w:type="dxa" w:w="1224"/>
+            <w:vAlign w:val="center"/>
           </w:tcPr>
           <w:p>
+            <w:pPr>
+              <w:spacing w:after="0"/>
+            </w:pPr>
+            <w:r/>
             <w:r>
               <w:rPr>
-                <w:rFonts w:ascii="Arial" w:hAnsi="Arial"/>
+                <w:rFonts w:ascii="Microsoft YaHei" w:hAnsi="Microsoft YaHei" w:eastAsia="Microsoft YaHei"/>
                 <w:b w:val="0"/>
-                <w:sz w:val="22"/>
+                <w:sz w:val="17"/>
               </w:rPr>
-              <w:t>Indonesian License Plate Detection Dataset</w:t>
+              <w:t>胡哲祺</w:t>
             </w:r>
           </w:p>
         </w:tc>
         <w:tc>
           <w:tcPr>
-            <w:tcW w:type="dxa" w:w="3120"/>
+            <w:tcW w:type="dxa" w:w="1512"/>
+            <w:vAlign w:val="center"/>
           </w:tcPr>
           <w:p>
+            <w:pPr>
+              <w:spacing w:after="0"/>
+            </w:pPr>
+            <w:r/>
             <w:r>
               <w:rPr>
-                <w:rFonts w:ascii="Arial" w:hAnsi="Arial"/>
+                <w:rFonts w:ascii="Microsoft YaHei" w:hAnsi="Microsoft YaHei" w:eastAsia="Microsoft YaHei"/>
                 <w:b w:val="0"/>
-                <w:sz w:val="22"/>
+                <w:sz w:val="17"/>
               </w:rPr>
-              <w:t>Zenodo / Roboflow Universe，DOI: 10.5281/zenodo.15605718</w:t>
+              <w:t>24281098</w:t>
             </w:r>
           </w:p>
         </w:tc>
         <w:tc>
           <w:tcPr>
-            <w:tcW w:type="dxa" w:w="3120"/>
+            <w:tcW w:type="dxa" w:w="1008"/>
+            <w:vAlign w:val="center"/>
           </w:tcPr>
           <w:p>
+            <w:pPr>
+              <w:spacing w:after="0"/>
+            </w:pPr>
+            <w:r/>
             <w:r>
               <w:rPr>
-                <w:rFonts w:ascii="Arial" w:hAnsi="Arial"/>
+                <w:rFonts w:ascii="Microsoft YaHei" w:hAnsi="Microsoft YaHei" w:eastAsia="Microsoft YaHei"/>
                 <w:b w:val="0"/>
-                <w:sz w:val="22"/>
+                <w:sz w:val="17"/>
               </w:rPr>
-              <w:t>966</w:t>
+              <w:t>组长</w:t>
+            </w:r>
+          </w:p>
+        </w:tc>
+        <w:tc>
+          <w:tcPr>
+            <w:tcW w:type="dxa" w:w="5328"/>
+            <w:vAlign w:val="center"/>
+          </w:tcPr>
+          <w:p>
+            <w:pPr>
+              <w:spacing w:after="0"/>
+            </w:pPr>
+            <w:r/>
+            <w:r>
+              <w:rPr>
+                <w:rFonts w:ascii="Microsoft YaHei" w:hAnsi="Microsoft YaHei" w:eastAsia="Microsoft YaHei"/>
+                <w:b w:val="0"/>
+                <w:sz w:val="17"/>
+              </w:rPr>
+              <w:t>总体设计、进度统筹、报告统稿、模型训练验收、答辩组织</w:t>
+            </w:r>
+          </w:p>
+        </w:tc>
+        <w:tc>
+          <w:tcPr>
+            <w:tcW w:type="dxa" w:w="1008"/>
+            <w:vAlign w:val="center"/>
+          </w:tcPr>
+          <w:p>
+            <w:pPr>
+              <w:spacing w:after="0"/>
+            </w:pPr>
+            <w:r/>
+            <w:r>
+              <w:rPr>
+                <w:rFonts w:ascii="Microsoft YaHei" w:hAnsi="Microsoft YaHei" w:eastAsia="Microsoft YaHei"/>
+                <w:b w:val="0"/>
+                <w:sz w:val="17"/>
+              </w:rPr>
+              <w:t>40%</w:t>
             </w:r>
           </w:p>
         </w:tc>
@@ -330,46 +302,101 @@
       <w:tr>
         <w:tc>
           <w:tcPr>
-            <w:tcW w:type="dxa" w:w="3120"/>
+            <w:tcW w:type="dxa" w:w="1224"/>
+            <w:vAlign w:val="center"/>
           </w:tcPr>
           <w:p>
+            <w:pPr>
+              <w:spacing w:after="0"/>
+            </w:pPr>
+            <w:r/>
             <w:r>
               <w:rPr>
-                <w:rFonts w:ascii="Arial" w:hAnsi="Arial"/>
+                <w:rFonts w:ascii="Microsoft YaHei" w:hAnsi="Microsoft YaHei" w:eastAsia="Microsoft YaHei"/>
                 <w:b w:val="0"/>
-                <w:sz w:val="22"/>
+                <w:sz w:val="17"/>
               </w:rPr>
-              <w:t>Roboflow Public License Plates Dataset</w:t>
+              <w:t>温豪杰</w:t>
             </w:r>
           </w:p>
         </w:tc>
         <w:tc>
           <w:tcPr>
-            <w:tcW w:type="dxa" w:w="3120"/>
+            <w:tcW w:type="dxa" w:w="1512"/>
+            <w:vAlign w:val="center"/>
           </w:tcPr>
           <w:p>
+            <w:pPr>
+              <w:spacing w:after="0"/>
+            </w:pPr>
+            <w:r/>
             <w:r>
               <w:rPr>
-                <w:rFonts w:ascii="Arial" w:hAnsi="Arial"/>
+                <w:rFonts w:ascii="Microsoft YaHei" w:hAnsi="Microsoft YaHei" w:eastAsia="Microsoft YaHei"/>
                 <w:b w:val="0"/>
-                <w:sz w:val="22"/>
+                <w:sz w:val="17"/>
               </w:rPr>
-              <w:t>YOLO v5 PyTorch 格式</w:t>
+              <w:t>24281112</w:t>
             </w:r>
           </w:p>
         </w:tc>
         <w:tc>
           <w:tcPr>
-            <w:tcW w:type="dxa" w:w="3120"/>
+            <w:tcW w:type="dxa" w:w="1008"/>
+            <w:vAlign w:val="center"/>
           </w:tcPr>
           <w:p>
+            <w:pPr>
+              <w:spacing w:after="0"/>
+            </w:pPr>
+            <w:r/>
             <w:r>
               <w:rPr>
-                <w:rFonts w:ascii="Arial" w:hAnsi="Arial"/>
+                <w:rFonts w:ascii="Microsoft YaHei" w:hAnsi="Microsoft YaHei" w:eastAsia="Microsoft YaHei"/>
                 <w:b w:val="0"/>
-                <w:sz w:val="22"/>
+                <w:sz w:val="17"/>
               </w:rPr>
-              <w:t>350</w:t>
+              <w:t>组员</w:t>
+            </w:r>
+          </w:p>
+        </w:tc>
+        <w:tc>
+          <w:tcPr>
+            <w:tcW w:type="dxa" w:w="5328"/>
+            <w:vAlign w:val="center"/>
+          </w:tcPr>
+          <w:p>
+            <w:pPr>
+              <w:spacing w:after="0"/>
+            </w:pPr>
+            <w:r/>
+            <w:r>
+              <w:rPr>
+                <w:rFonts w:ascii="Microsoft YaHei" w:hAnsi="Microsoft YaHei" w:eastAsia="Microsoft YaHei"/>
+                <w:b w:val="0"/>
+                <w:sz w:val="17"/>
+              </w:rPr>
+              <w:t>数据集整理、训练脚本、模型训练、实验结果分析</w:t>
+            </w:r>
+          </w:p>
+        </w:tc>
+        <w:tc>
+          <w:tcPr>
+            <w:tcW w:type="dxa" w:w="1008"/>
+            <w:vAlign w:val="center"/>
+          </w:tcPr>
+          <w:p>
+            <w:pPr>
+              <w:spacing w:after="0"/>
+            </w:pPr>
+            <w:r/>
+            <w:r>
+              <w:rPr>
+                <w:rFonts w:ascii="Microsoft YaHei" w:hAnsi="Microsoft YaHei" w:eastAsia="Microsoft YaHei"/>
+                <w:b w:val="0"/>
+                <w:sz w:val="17"/>
+              </w:rPr>
+              <w:t>30%</w:t>
             </w:r>
           </w:p>
         </w:tc>
@@ -377,233 +404,101 @@
       <w:tr>
         <w:tc>
           <w:tcPr>
-            <w:tcW w:type="dxa" w:w="3120"/>
+            <w:tcW w:type="dxa" w:w="1224"/>
+            <w:vAlign w:val="center"/>
           </w:tcPr>
           <w:p>
+            <w:pPr>
+              <w:spacing w:after="0"/>
+            </w:pPr>
+            <w:r/>
             <w:r>
               <w:rPr>
-                <w:rFonts w:ascii="Arial" w:hAnsi="Arial"/>
+                <w:rFonts w:ascii="Microsoft YaHei" w:hAnsi="Microsoft YaHei" w:eastAsia="Microsoft YaHei"/>
                 <w:b w:val="0"/>
-                <w:sz w:val="22"/>
+                <w:sz w:val="17"/>
               </w:rPr>
-              <w:t>Kaggle ALPR Dataset</w:t>
+              <w:t>杨大松</w:t>
             </w:r>
           </w:p>
         </w:tc>
         <w:tc>
           <w:tcPr>
-            <w:tcW w:type="dxa" w:w="3120"/>
+            <w:tcW w:type="dxa" w:w="1512"/>
+            <w:vAlign w:val="center"/>
           </w:tcPr>
           <w:p>
+            <w:pPr>
+              <w:spacing w:after="0"/>
+            </w:pPr>
+            <w:r/>
             <w:r>
               <w:rPr>
-                <w:rFonts w:ascii="Arial" w:hAnsi="Arial"/>
+                <w:rFonts w:ascii="Microsoft YaHei" w:hAnsi="Microsoft YaHei" w:eastAsia="Microsoft YaHei"/>
                 <w:b w:val="0"/>
-                <w:sz w:val="22"/>
+                <w:sz w:val="17"/>
               </w:rPr>
-              <w:t>Automatic License Plate Recognition 数据集</w:t>
+              <w:t>24281118</w:t>
             </w:r>
           </w:p>
         </w:tc>
         <w:tc>
           <w:tcPr>
-            <w:tcW w:type="dxa" w:w="3120"/>
+            <w:tcW w:type="dxa" w:w="1008"/>
+            <w:vAlign w:val="center"/>
           </w:tcPr>
           <w:p>
+            <w:pPr>
+              <w:spacing w:after="0"/>
+            </w:pPr>
+            <w:r/>
             <w:r>
               <w:rPr>
-                <w:rFonts w:ascii="Arial" w:hAnsi="Arial"/>
+                <w:rFonts w:ascii="Microsoft YaHei" w:hAnsi="Microsoft YaHei" w:eastAsia="Microsoft YaHei"/>
                 <w:b w:val="0"/>
-                <w:sz w:val="22"/>
+                <w:sz w:val="17"/>
               </w:rPr>
-              <w:t>24238</w:t>
-            </w:r>
-          </w:p>
-        </w:tc>
-      </w:tr>
-      <w:tr>
-        <w:tc>
-          <w:tcPr>
-            <w:tcW w:type="dxa" w:w="3120"/>
-          </w:tcPr>
-          <w:p>
-            <w:r>
-              <w:rPr>
-                <w:rFonts w:ascii="Arial" w:hAnsi="Arial"/>
-                <w:b w:val="0"/>
-                <w:sz w:val="22"/>
-              </w:rPr>
-              <w:t>合计</w:t>
+              <w:t>组员</w:t>
             </w:r>
           </w:p>
         </w:tc>
         <w:tc>
           <w:tcPr>
-            <w:tcW w:type="dxa" w:w="3120"/>
+            <w:tcW w:type="dxa" w:w="5328"/>
+            <w:vAlign w:val="center"/>
           </w:tcPr>
           <w:p>
+            <w:pPr>
+              <w:spacing w:after="0"/>
+            </w:pPr>
+            <w:r/>
             <w:r>
               <w:rPr>
-                <w:rFonts w:ascii="Arial" w:hAnsi="Arial"/>
+                <w:rFonts w:ascii="Microsoft YaHei" w:hAnsi="Microsoft YaHei" w:eastAsia="Microsoft YaHei"/>
                 <w:b w:val="0"/>
-                <w:sz w:val="22"/>
+                <w:sz w:val="17"/>
               </w:rPr>
-              <w:t>合并后用于训练、验证、测试</w:t>
+              <w:t>Flask 后端、前端管理系统、OCR 与车辆档案匹配、运行截图和演示材料</w:t>
             </w:r>
           </w:p>
         </w:tc>
         <w:tc>
           <w:tcPr>
-            <w:tcW w:type="dxa" w:w="3120"/>
+            <w:tcW w:type="dxa" w:w="1008"/>
+            <w:vAlign w:val="center"/>
           </w:tcPr>
           <w:p>
+            <w:pPr>
+              <w:spacing w:after="0"/>
+            </w:pPr>
+            <w:r/>
             <w:r>
               <w:rPr>
-                <w:rFonts w:ascii="Arial" w:hAnsi="Arial"/>
+                <w:rFonts w:ascii="Microsoft YaHei" w:hAnsi="Microsoft YaHei" w:eastAsia="Microsoft YaHei"/>
                 <w:b w:val="0"/>
-                <w:sz w:val="22"/>
+                <w:sz w:val="17"/>
               </w:rPr>
-              <w:t>25554</w:t>
-            </w:r>
-          </w:p>
-        </w:tc>
-      </w:tr>
-    </w:tbl>
-    <w:p/>
-    <w:tbl>
-      <w:tblPr>
-        <w:tblStyle w:val="TableGrid"/>
-        <w:tblW w:type="auto" w:w="0"/>
-        <w:tblLook w:firstColumn="1" w:firstRow="1" w:lastColumn="0" w:lastRow="0" w:noHBand="0" w:noVBand="1" w:val="04A0"/>
-      </w:tblPr>
-      <w:tblGrid>
-        <w:gridCol w:w="4680"/>
-        <w:gridCol w:w="4680"/>
-      </w:tblGrid>
-      <w:tr>
-        <w:tc>
-          <w:tcPr>
-            <w:tcW w:type="dxa" w:w="4680"/>
-          </w:tcPr>
-          <w:p>
-            <w:r>
-              <w:rPr>
-                <w:rFonts w:ascii="Arial" w:hAnsi="Arial"/>
-                <w:b/>
-                <w:sz w:val="22"/>
-              </w:rPr>
-              <w:t>划分</w:t>
-            </w:r>
-          </w:p>
-        </w:tc>
-        <w:tc>
-          <w:tcPr>
-            <w:tcW w:type="dxa" w:w="4680"/>
-          </w:tcPr>
-          <w:p>
-            <w:r>
-              <w:rPr>
-                <w:rFonts w:ascii="Arial" w:hAnsi="Arial"/>
-                <w:b/>
-                <w:sz w:val="22"/>
-              </w:rPr>
-              <w:t>图片数量</w:t>
-            </w:r>
-          </w:p>
-        </w:tc>
-      </w:tr>
-      <w:tr>
-        <w:tc>
-          <w:tcPr>
-            <w:tcW w:type="dxa" w:w="4680"/>
-          </w:tcPr>
-          <w:p>
-            <w:r>
-              <w:rPr>
-                <w:rFonts w:ascii="Arial" w:hAnsi="Arial"/>
-                <w:b w:val="0"/>
-                <w:sz w:val="22"/>
-              </w:rPr>
-              <w:t>训练集</w:t>
-            </w:r>
-          </w:p>
-        </w:tc>
-        <w:tc>
-          <w:tcPr>
-            <w:tcW w:type="dxa" w:w="4680"/>
-          </w:tcPr>
-          <w:p>
-            <w:r>
-              <w:rPr>
-                <w:rFonts w:ascii="Arial" w:hAnsi="Arial"/>
-                <w:b w:val="0"/>
-                <w:sz w:val="22"/>
-              </w:rPr>
-              <w:t>22094</w:t>
-            </w:r>
-          </w:p>
-        </w:tc>
-      </w:tr>
-      <w:tr>
-        <w:tc>
-          <w:tcPr>
-            <w:tcW w:type="dxa" w:w="4680"/>
-          </w:tcPr>
-          <w:p>
-            <w:r>
-              <w:rPr>
-                <w:rFonts w:ascii="Arial" w:hAnsi="Arial"/>
-                <w:b w:val="0"/>
-                <w:sz w:val="22"/>
-              </w:rPr>
-              <w:t>验证集</w:t>
-            </w:r>
-          </w:p>
-        </w:tc>
-        <w:tc>
-          <w:tcPr>
-            <w:tcW w:type="dxa" w:w="4680"/>
-          </w:tcPr>
-          <w:p>
-            <w:r>
-              <w:rPr>
-                <w:rFonts w:ascii="Arial" w:hAnsi="Arial"/>
-                <w:b w:val="0"/>
-                <w:sz w:val="22"/>
-              </w:rPr>
-              <w:t>2310</w:t>
-            </w:r>
-          </w:p>
-        </w:tc>
-      </w:tr>
-      <w:tr>
-        <w:tc>
-          <w:tcPr>
-            <w:tcW w:type="dxa" w:w="4680"/>
-          </w:tcPr>
-          <w:p>
-            <w:r>
-              <w:rPr>
-                <w:rFonts w:ascii="Arial" w:hAnsi="Arial"/>
-                <w:b w:val="0"/>
-                <w:sz w:val="22"/>
-              </w:rPr>
-              <w:t>测试集</w:t>
-            </w:r>
-          </w:p>
-        </w:tc>
-        <w:tc>
-          <w:tcPr>
-            <w:tcW w:type="dxa" w:w="4680"/>
-          </w:tcPr>
-          <w:p>
-            <w:r>
-              <w:rPr>
-                <w:rFonts w:ascii="Arial" w:hAnsi="Arial"/>
-                <w:b w:val="0"/>
-                <w:sz w:val="22"/>
-              </w:rPr>
-              <w:t>1150</w:t>
+              <w:t>30%</w:t>
             </w:r>
           </w:p>
         </w:tc>
@@ -615,66 +510,158 @@
         <w:pStyle w:val="Heading1"/>
       </w:pPr>
       <w:r>
-        <w:rPr>
-          <w:rFonts w:ascii="Arial" w:hAnsi="Arial"/>
-          <w:b/>
-          <w:color w:val="2E74B5"/>
-          <w:sz w:val="32"/>
-        </w:rPr>
-        <w:t>四、模型设计与训练</w:t>
+        <w:t>一、项目背景与需求</w:t>
       </w:r>
     </w:p>
     <w:p>
       <w:pPr>
-        <w:spacing w:after="120" w:line="276" w:lineRule="auto"/>
+        <w:spacing w:line="283" w:lineRule="auto" w:after="120"/>
       </w:pPr>
       <w:r>
         <w:rPr>
-          <w:rFonts w:ascii="Arial" w:hAnsi="Arial"/>
+          <w:rFonts w:ascii="Microsoft YaHei" w:hAnsi="Microsoft YaHei" w:eastAsia="Microsoft YaHei"/>
           <w:b w:val="0"/>
-          <w:sz w:val="22"/>
+          <w:sz w:val="21"/>
         </w:rPr>
-        <w:t>考虑课程项目的可运行性和训练速度，本项目实现了一个轻量 YOLO 风格网格检测模型。模型将输入图像缩放到 256×256，并映射到 10×10 网格，每个网格预测目标置信度、边界框坐标和类别概率。训练时使用 AdamW 优化器、余弦退火学习率、Smooth L1 边界框损失和二分类交叉熵损失。</w:t>
+        <w:t>校园门口、停车场和企业园区出入口通常需要记录车辆通行情况。传统人工登记或人工查看监控画面的方式效率较低，也不利于后续统计、追溯和管理。本项目选择车牌识别作为视觉 AI 应用方向，以图片识别为入口，构建一个可训练、可推理、可展示、可提交的完整课程项目。</w:t>
+      </w:r>
+    </w:p>
+    <w:p>
+      <w:pPr>
+        <w:pStyle w:val="ListBullet"/>
+        <w:spacing w:after="60"/>
+      </w:pPr>
+      <w:r>
+        <w:rPr>
+          <w:rFonts w:ascii="Microsoft YaHei" w:hAnsi="Microsoft YaHei" w:eastAsia="Microsoft YaHei"/>
+          <w:sz w:val="20"/>
+        </w:rPr>
+        <w:t>支持上传车辆图片并展示原图和 AI 标注结果。</w:t>
+      </w:r>
+    </w:p>
+    <w:p>
+      <w:pPr>
+        <w:pStyle w:val="ListBullet"/>
+        <w:spacing w:after="60"/>
+      </w:pPr>
+      <w:r>
+        <w:rPr>
+          <w:rFonts w:ascii="Microsoft YaHei" w:hAnsi="Microsoft YaHei" w:eastAsia="Microsoft YaHei"/>
+          <w:sz w:val="20"/>
+        </w:rPr>
+        <w:t>检测车辆与车牌区域，输出类别、坐标、置信度和裁剪图。</w:t>
+      </w:r>
+    </w:p>
+    <w:p>
+      <w:pPr>
+        <w:pStyle w:val="ListBullet"/>
+        <w:spacing w:after="60"/>
+      </w:pPr>
+      <w:r>
+        <w:rPr>
+          <w:rFonts w:ascii="Microsoft YaHei" w:hAnsi="Microsoft YaHei" w:eastAsia="Microsoft YaHei"/>
+          <w:sz w:val="20"/>
+        </w:rPr>
+        <w:t>识别车牌号后自动查询车辆档案，返回车主/部门、车辆类型、权限状态等信息。</w:t>
+      </w:r>
+    </w:p>
+    <w:p>
+      <w:pPr>
+        <w:pStyle w:val="ListBullet"/>
+        <w:spacing w:after="60"/>
+      </w:pPr>
+      <w:r>
+        <w:rPr>
+          <w:rFonts w:ascii="Microsoft YaHei" w:hAnsi="Microsoft YaHei" w:eastAsia="Microsoft YaHei"/>
+          <w:sz w:val="20"/>
+        </w:rPr>
+        <w:t>提供真实运行截图和开发阶段截图，用于报告、PPT 和演示视频。</w:t>
+      </w:r>
+    </w:p>
+    <w:p>
+      <w:pPr>
+        <w:pStyle w:val="Heading1"/>
+      </w:pPr>
+      <w:r>
+        <w:t>二、数据集来源与处理</w:t>
       </w:r>
     </w:p>
     <w:tbl>
       <w:tblPr>
         <w:tblStyle w:val="TableGrid"/>
         <w:tblW w:type="auto" w:w="0"/>
+        <w:jc w:val="center"/>
         <w:tblLook w:firstColumn="1" w:firstRow="1" w:lastColumn="0" w:lastRow="0" w:noHBand="0" w:noVBand="1" w:val="04A0"/>
       </w:tblPr>
       <w:tblGrid>
-        <w:gridCol w:w="4680"/>
-        <w:gridCol w:w="4680"/>
+        <w:gridCol w:w="3360"/>
+        <w:gridCol w:w="3360"/>
+        <w:gridCol w:w="3360"/>
       </w:tblGrid>
       <w:tr>
         <w:tc>
           <w:tcPr>
-            <w:tcW w:type="dxa" w:w="4680"/>
+            <w:tcW w:type="dxa" w:w="2448"/>
+            <w:shd w:fill="DBEAFE"/>
+            <w:vAlign w:val="center"/>
           </w:tcPr>
           <w:p>
+            <w:pPr>
+              <w:spacing w:after="0"/>
+            </w:pPr>
+            <w:r/>
             <w:r>
               <w:rPr>
-                <w:rFonts w:ascii="Arial" w:hAnsi="Arial"/>
+                <w:rFonts w:ascii="Microsoft YaHei" w:hAnsi="Microsoft YaHei" w:eastAsia="Microsoft YaHei"/>
                 <w:b/>
-                <w:sz w:val="22"/>
+                <w:color w:val="1E40AF"/>
+                <w:sz w:val="18"/>
               </w:rPr>
-              <w:t>训练配置</w:t>
+              <w:t>数据来源</w:t>
             </w:r>
           </w:p>
         </w:tc>
         <w:tc>
           <w:tcPr>
-            <w:tcW w:type="dxa" w:w="4680"/>
+            <w:tcW w:type="dxa" w:w="5184"/>
+            <w:shd w:fill="DBEAFE"/>
+            <w:vAlign w:val="center"/>
           </w:tcPr>
           <w:p>
+            <w:pPr>
+              <w:spacing w:after="0"/>
+            </w:pPr>
+            <w:r/>
             <w:r>
               <w:rPr>
-                <w:rFonts w:ascii="Arial" w:hAnsi="Arial"/>
+                <w:rFonts w:ascii="Microsoft YaHei" w:hAnsi="Microsoft YaHei" w:eastAsia="Microsoft YaHei"/>
                 <w:b/>
-                <w:sz w:val="22"/>
+                <w:color w:val="1E40AF"/>
+                <w:sz w:val="18"/>
               </w:rPr>
-              <w:t>取值</w:t>
+              <w:t>说明</w:t>
+            </w:r>
+          </w:p>
+        </w:tc>
+        <w:tc>
+          <w:tcPr>
+            <w:tcW w:type="dxa" w:w="1296"/>
+            <w:shd w:fill="DBEAFE"/>
+            <w:vAlign w:val="center"/>
+          </w:tcPr>
+          <w:p>
+            <w:pPr>
+              <w:spacing w:after="0"/>
+            </w:pPr>
+            <w:r/>
+            <w:r>
+              <w:rPr>
+                <w:rFonts w:ascii="Microsoft YaHei" w:hAnsi="Microsoft YaHei" w:eastAsia="Microsoft YaHei"/>
+                <w:b/>
+                <w:color w:val="1E40AF"/>
+                <w:sz w:val="18"/>
+              </w:rPr>
+              <w:t>规模</w:t>
             </w:r>
           </w:p>
         </w:tc>
@@ -682,31 +669,61 @@
       <w:tr>
         <w:tc>
           <w:tcPr>
-            <w:tcW w:type="dxa" w:w="4680"/>
+            <w:tcW w:type="dxa" w:w="2448"/>
+            <w:vAlign w:val="center"/>
           </w:tcPr>
           <w:p>
+            <w:pPr>
+              <w:spacing w:after="0"/>
+            </w:pPr>
+            <w:r/>
             <w:r>
               <w:rPr>
-                <w:rFonts w:ascii="Arial" w:hAnsi="Arial"/>
+                <w:rFonts w:ascii="Microsoft YaHei" w:hAnsi="Microsoft YaHei" w:eastAsia="Microsoft YaHei"/>
                 <w:b w:val="0"/>
-                <w:sz w:val="22"/>
+                <w:sz w:val="17"/>
               </w:rPr>
-              <w:t>模型</w:t>
+              <w:t>Indonesian License Plate Detection Dataset</w:t>
             </w:r>
           </w:p>
         </w:tc>
         <w:tc>
           <w:tcPr>
-            <w:tcW w:type="dxa" w:w="4680"/>
+            <w:tcW w:type="dxa" w:w="5184"/>
+            <w:vAlign w:val="center"/>
           </w:tcPr>
           <w:p>
+            <w:pPr>
+              <w:spacing w:after="0"/>
+            </w:pPr>
+            <w:r/>
             <w:r>
               <w:rPr>
-                <w:rFonts w:ascii="Arial" w:hAnsi="Arial"/>
+                <w:rFonts w:ascii="Microsoft YaHei" w:hAnsi="Microsoft YaHei" w:eastAsia="Microsoft YaHei"/>
                 <w:b w:val="0"/>
-                <w:sz w:val="22"/>
+                <w:sz w:val="17"/>
               </w:rPr>
-              <w:t>Tiny-YOLO 风格网格检测模型</w:t>
+              <w:t>Zenodo / Roboflow Universe，DOI: 10.5281/zenodo.15605718</w:t>
+            </w:r>
+          </w:p>
+        </w:tc>
+        <w:tc>
+          <w:tcPr>
+            <w:tcW w:type="dxa" w:w="1296"/>
+            <w:vAlign w:val="center"/>
+          </w:tcPr>
+          <w:p>
+            <w:pPr>
+              <w:spacing w:after="0"/>
+            </w:pPr>
+            <w:r/>
+            <w:r>
+              <w:rPr>
+                <w:rFonts w:ascii="Microsoft YaHei" w:hAnsi="Microsoft YaHei" w:eastAsia="Microsoft YaHei"/>
+                <w:b w:val="0"/>
+                <w:sz w:val="17"/>
+              </w:rPr>
+              <w:t>966 张</w:t>
             </w:r>
           </w:p>
         </w:tc>
@@ -714,31 +731,61 @@
       <w:tr>
         <w:tc>
           <w:tcPr>
-            <w:tcW w:type="dxa" w:w="4680"/>
+            <w:tcW w:type="dxa" w:w="2448"/>
+            <w:vAlign w:val="center"/>
           </w:tcPr>
           <w:p>
+            <w:pPr>
+              <w:spacing w:after="0"/>
+            </w:pPr>
+            <w:r/>
             <w:r>
               <w:rPr>
-                <w:rFonts w:ascii="Arial" w:hAnsi="Arial"/>
+                <w:rFonts w:ascii="Microsoft YaHei" w:hAnsi="Microsoft YaHei" w:eastAsia="Microsoft YaHei"/>
                 <w:b w:val="0"/>
-                <w:sz w:val="22"/>
+                <w:sz w:val="17"/>
               </w:rPr>
-              <w:t>输入尺寸</w:t>
+              <w:t>Roboflow Public License Plates Dataset</w:t>
             </w:r>
           </w:p>
         </w:tc>
         <w:tc>
           <w:tcPr>
-            <w:tcW w:type="dxa" w:w="4680"/>
+            <w:tcW w:type="dxa" w:w="5184"/>
+            <w:vAlign w:val="center"/>
           </w:tcPr>
           <w:p>
+            <w:pPr>
+              <w:spacing w:after="0"/>
+            </w:pPr>
+            <w:r/>
             <w:r>
               <w:rPr>
-                <w:rFonts w:ascii="Arial" w:hAnsi="Arial"/>
+                <w:rFonts w:ascii="Microsoft YaHei" w:hAnsi="Microsoft YaHei" w:eastAsia="Microsoft YaHei"/>
                 <w:b w:val="0"/>
-                <w:sz w:val="22"/>
+                <w:sz w:val="17"/>
               </w:rPr>
-              <w:t>256×256</w:t>
+              <w:t>License Plates 数据集，YOLO v5 PyTorch 格式</w:t>
+            </w:r>
+          </w:p>
+        </w:tc>
+        <w:tc>
+          <w:tcPr>
+            <w:tcW w:type="dxa" w:w="1296"/>
+            <w:vAlign w:val="center"/>
+          </w:tcPr>
+          <w:p>
+            <w:pPr>
+              <w:spacing w:after="0"/>
+            </w:pPr>
+            <w:r/>
+            <w:r>
+              <w:rPr>
+                <w:rFonts w:ascii="Microsoft YaHei" w:hAnsi="Microsoft YaHei" w:eastAsia="Microsoft YaHei"/>
+                <w:b w:val="0"/>
+                <w:sz w:val="17"/>
+              </w:rPr>
+              <w:t>350 张</w:t>
             </w:r>
           </w:p>
         </w:tc>
@@ -746,31 +793,61 @@
       <w:tr>
         <w:tc>
           <w:tcPr>
-            <w:tcW w:type="dxa" w:w="4680"/>
+            <w:tcW w:type="dxa" w:w="2448"/>
+            <w:vAlign w:val="center"/>
           </w:tcPr>
           <w:p>
+            <w:pPr>
+              <w:spacing w:after="0"/>
+            </w:pPr>
+            <w:r/>
             <w:r>
               <w:rPr>
-                <w:rFonts w:ascii="Arial" w:hAnsi="Arial"/>
+                <w:rFonts w:ascii="Microsoft YaHei" w:hAnsi="Microsoft YaHei" w:eastAsia="Microsoft YaHei"/>
                 <w:b w:val="0"/>
-                <w:sz w:val="22"/>
+                <w:sz w:val="17"/>
               </w:rPr>
-              <w:t>网格尺寸</w:t>
+              <w:t>Kaggle ALPR Dataset</w:t>
             </w:r>
           </w:p>
         </w:tc>
         <w:tc>
           <w:tcPr>
-            <w:tcW w:type="dxa" w:w="4680"/>
+            <w:tcW w:type="dxa" w:w="5184"/>
+            <w:vAlign w:val="center"/>
           </w:tcPr>
           <w:p>
+            <w:pPr>
+              <w:spacing w:after="0"/>
+            </w:pPr>
+            <w:r/>
             <w:r>
               <w:rPr>
-                <w:rFonts w:ascii="Arial" w:hAnsi="Arial"/>
+                <w:rFonts w:ascii="Microsoft YaHei" w:hAnsi="Microsoft YaHei" w:eastAsia="Microsoft YaHei"/>
                 <w:b w:val="0"/>
-                <w:sz w:val="22"/>
+                <w:sz w:val="17"/>
               </w:rPr>
-              <w:t>10×10</w:t>
+              <w:t>Automatic License Plate Recognition (ALPR) Dataset</w:t>
+            </w:r>
+          </w:p>
+        </w:tc>
+        <w:tc>
+          <w:tcPr>
+            <w:tcW w:type="dxa" w:w="1296"/>
+            <w:vAlign w:val="center"/>
+          </w:tcPr>
+          <w:p>
+            <w:pPr>
+              <w:spacing w:after="0"/>
+            </w:pPr>
+            <w:r/>
+            <w:r>
+              <w:rPr>
+                <w:rFonts w:ascii="Microsoft YaHei" w:hAnsi="Microsoft YaHei" w:eastAsia="Microsoft YaHei"/>
+                <w:b w:val="0"/>
+                <w:sz w:val="17"/>
+              </w:rPr>
+              <w:t>24238 张</w:t>
             </w:r>
           </w:p>
         </w:tc>
@@ -778,31 +855,143 @@
       <w:tr>
         <w:tc>
           <w:tcPr>
-            <w:tcW w:type="dxa" w:w="4680"/>
+            <w:tcW w:type="dxa" w:w="2448"/>
+            <w:vAlign w:val="center"/>
           </w:tcPr>
           <w:p>
+            <w:pPr>
+              <w:spacing w:after="0"/>
+            </w:pPr>
+            <w:r/>
             <w:r>
               <w:rPr>
-                <w:rFonts w:ascii="Arial" w:hAnsi="Arial"/>
+                <w:rFonts w:ascii="Microsoft YaHei" w:hAnsi="Microsoft YaHei" w:eastAsia="Microsoft YaHei"/>
                 <w:b w:val="0"/>
-                <w:sz w:val="22"/>
+                <w:sz w:val="17"/>
               </w:rPr>
-              <w:t>训练轮数</w:t>
+              <w:t>合并后数据集</w:t>
             </w:r>
           </w:p>
         </w:tc>
         <w:tc>
           <w:tcPr>
-            <w:tcW w:type="dxa" w:w="4680"/>
+            <w:tcW w:type="dxa" w:w="5184"/>
+            <w:vAlign w:val="center"/>
           </w:tcPr>
           <w:p>
+            <w:pPr>
+              <w:spacing w:after="0"/>
+            </w:pPr>
+            <w:r/>
             <w:r>
               <w:rPr>
-                <w:rFonts w:ascii="Arial" w:hAnsi="Arial"/>
+                <w:rFonts w:ascii="Microsoft YaHei" w:hAnsi="Microsoft YaHei" w:eastAsia="Microsoft YaHei"/>
                 <w:b w:val="0"/>
-                <w:sz w:val="22"/>
+                <w:sz w:val="17"/>
               </w:rPr>
-              <w:t>12 epochs</w:t>
+              <w:t>统一整理到 datasets/combined，原始数据集不提交，只注明来源</w:t>
+            </w:r>
+          </w:p>
+        </w:tc>
+        <w:tc>
+          <w:tcPr>
+            <w:tcW w:type="dxa" w:w="1296"/>
+            <w:vAlign w:val="center"/>
+          </w:tcPr>
+          <w:p>
+            <w:pPr>
+              <w:spacing w:after="0"/>
+            </w:pPr>
+            <w:r/>
+            <w:r>
+              <w:rPr>
+                <w:rFonts w:ascii="Microsoft YaHei" w:hAnsi="Microsoft YaHei" w:eastAsia="Microsoft YaHei"/>
+                <w:b w:val="0"/>
+                <w:sz w:val="17"/>
+              </w:rPr>
+              <w:t>25554 张</w:t>
+            </w:r>
+          </w:p>
+        </w:tc>
+      </w:tr>
+    </w:tbl>
+    <w:p/>
+    <w:tbl>
+      <w:tblPr>
+        <w:tblStyle w:val="TableGrid"/>
+        <w:tblW w:type="auto" w:w="0"/>
+        <w:jc w:val="center"/>
+        <w:tblLook w:firstColumn="1" w:firstRow="1" w:lastColumn="0" w:lastRow="0" w:noHBand="0" w:noVBand="1" w:val="04A0"/>
+      </w:tblPr>
+      <w:tblGrid>
+        <w:gridCol w:w="3360"/>
+        <w:gridCol w:w="3360"/>
+        <w:gridCol w:w="3360"/>
+      </w:tblGrid>
+      <w:tr>
+        <w:tc>
+          <w:tcPr>
+            <w:tcW w:type="dxa" w:w="1728"/>
+            <w:shd w:fill="DBEAFE"/>
+            <w:vAlign w:val="center"/>
+          </w:tcPr>
+          <w:p>
+            <w:pPr>
+              <w:spacing w:after="0"/>
+            </w:pPr>
+            <w:r/>
+            <w:r>
+              <w:rPr>
+                <w:rFonts w:ascii="Microsoft YaHei" w:hAnsi="Microsoft YaHei" w:eastAsia="Microsoft YaHei"/>
+                <w:b/>
+                <w:color w:val="1E40AF"/>
+                <w:sz w:val="18"/>
+              </w:rPr>
+              <w:t>划分</w:t>
+            </w:r>
+          </w:p>
+        </w:tc>
+        <w:tc>
+          <w:tcPr>
+            <w:tcW w:type="dxa" w:w="1440"/>
+            <w:shd w:fill="DBEAFE"/>
+            <w:vAlign w:val="center"/>
+          </w:tcPr>
+          <w:p>
+            <w:pPr>
+              <w:spacing w:after="0"/>
+            </w:pPr>
+            <w:r/>
+            <w:r>
+              <w:rPr>
+                <w:rFonts w:ascii="Microsoft YaHei" w:hAnsi="Microsoft YaHei" w:eastAsia="Microsoft YaHei"/>
+                <w:b/>
+                <w:color w:val="1E40AF"/>
+                <w:sz w:val="18"/>
+              </w:rPr>
+              <w:t>图片数量</w:t>
+            </w:r>
+          </w:p>
+        </w:tc>
+        <w:tc>
+          <w:tcPr>
+            <w:tcW w:type="dxa" w:w="5472"/>
+            <w:shd w:fill="DBEAFE"/>
+            <w:vAlign w:val="center"/>
+          </w:tcPr>
+          <w:p>
+            <w:pPr>
+              <w:spacing w:after="0"/>
+            </w:pPr>
+            <w:r/>
+            <w:r>
+              <w:rPr>
+                <w:rFonts w:ascii="Microsoft YaHei" w:hAnsi="Microsoft YaHei" w:eastAsia="Microsoft YaHei"/>
+                <w:b/>
+                <w:color w:val="1E40AF"/>
+                <w:sz w:val="18"/>
+              </w:rPr>
+              <w:t>用途</w:t>
             </w:r>
           </w:p>
         </w:tc>
@@ -810,31 +999,61 @@
       <w:tr>
         <w:tc>
           <w:tcPr>
-            <w:tcW w:type="dxa" w:w="4680"/>
+            <w:tcW w:type="dxa" w:w="1728"/>
+            <w:vAlign w:val="center"/>
           </w:tcPr>
           <w:p>
+            <w:pPr>
+              <w:spacing w:after="0"/>
+            </w:pPr>
+            <w:r/>
             <w:r>
               <w:rPr>
-                <w:rFonts w:ascii="Arial" w:hAnsi="Arial"/>
+                <w:rFonts w:ascii="Microsoft YaHei" w:hAnsi="Microsoft YaHei" w:eastAsia="Microsoft YaHei"/>
                 <w:b w:val="0"/>
-                <w:sz w:val="22"/>
+                <w:sz w:val="17"/>
               </w:rPr>
-              <w:t>Batch size</w:t>
+              <w:t>训练集</w:t>
             </w:r>
           </w:p>
         </w:tc>
         <w:tc>
           <w:tcPr>
-            <w:tcW w:type="dxa" w:w="4680"/>
+            <w:tcW w:type="dxa" w:w="1440"/>
+            <w:vAlign w:val="center"/>
           </w:tcPr>
           <w:p>
+            <w:pPr>
+              <w:spacing w:after="0"/>
+            </w:pPr>
+            <w:r/>
             <w:r>
               <w:rPr>
-                <w:rFonts w:ascii="Arial" w:hAnsi="Arial"/>
+                <w:rFonts w:ascii="Microsoft YaHei" w:hAnsi="Microsoft YaHei" w:eastAsia="Microsoft YaHei"/>
                 <w:b w:val="0"/>
-                <w:sz w:val="22"/>
+                <w:sz w:val="17"/>
               </w:rPr>
-              <w:t>64</w:t>
+              <w:t>22094</w:t>
+            </w:r>
+          </w:p>
+        </w:tc>
+        <w:tc>
+          <w:tcPr>
+            <w:tcW w:type="dxa" w:w="5472"/>
+            <w:vAlign w:val="center"/>
+          </w:tcPr>
+          <w:p>
+            <w:pPr>
+              <w:spacing w:after="0"/>
+            </w:pPr>
+            <w:r/>
+            <w:r>
+              <w:rPr>
+                <w:rFonts w:ascii="Microsoft YaHei" w:hAnsi="Microsoft YaHei" w:eastAsia="Microsoft YaHei"/>
+                <w:b w:val="0"/>
+                <w:sz w:val="17"/>
+              </w:rPr>
+              <w:t>模型参数学习</w:t>
             </w:r>
           </w:p>
         </w:tc>
@@ -842,31 +1061,61 @@
       <w:tr>
         <w:tc>
           <w:tcPr>
-            <w:tcW w:type="dxa" w:w="4680"/>
+            <w:tcW w:type="dxa" w:w="1728"/>
+            <w:vAlign w:val="center"/>
           </w:tcPr>
           <w:p>
+            <w:pPr>
+              <w:spacing w:after="0"/>
+            </w:pPr>
+            <w:r/>
             <w:r>
               <w:rPr>
-                <w:rFonts w:ascii="Arial" w:hAnsi="Arial"/>
+                <w:rFonts w:ascii="Microsoft YaHei" w:hAnsi="Microsoft YaHei" w:eastAsia="Microsoft YaHei"/>
                 <w:b w:val="0"/>
-                <w:sz w:val="22"/>
+                <w:sz w:val="17"/>
               </w:rPr>
-              <w:t>数据增强</w:t>
+              <w:t>验证集</w:t>
             </w:r>
           </w:p>
         </w:tc>
         <w:tc>
           <w:tcPr>
-            <w:tcW w:type="dxa" w:w="4680"/>
+            <w:tcW w:type="dxa" w:w="1440"/>
+            <w:vAlign w:val="center"/>
           </w:tcPr>
           <w:p>
+            <w:pPr>
+              <w:spacing w:after="0"/>
+            </w:pPr>
+            <w:r/>
             <w:r>
               <w:rPr>
-                <w:rFonts w:ascii="Arial" w:hAnsi="Arial"/>
+                <w:rFonts w:ascii="Microsoft YaHei" w:hAnsi="Microsoft YaHei" w:eastAsia="Microsoft YaHei"/>
                 <w:b w:val="0"/>
-                <w:sz w:val="22"/>
+                <w:sz w:val="17"/>
               </w:rPr>
-              <w:t>亮度、对比度、噪声、轻微模糊</w:t>
+              <w:t>2310</w:t>
+            </w:r>
+          </w:p>
+        </w:tc>
+        <w:tc>
+          <w:tcPr>
+            <w:tcW w:type="dxa" w:w="5472"/>
+            <w:vAlign w:val="center"/>
+          </w:tcPr>
+          <w:p>
+            <w:pPr>
+              <w:spacing w:after="0"/>
+            </w:pPr>
+            <w:r/>
+            <w:r>
+              <w:rPr>
+                <w:rFonts w:ascii="Microsoft YaHei" w:hAnsi="Microsoft YaHei" w:eastAsia="Microsoft YaHei"/>
+                <w:b w:val="0"/>
+                <w:sz w:val="17"/>
+              </w:rPr>
+              <w:t>调参与保存最佳模型</w:t>
             </w:r>
           </w:p>
         </w:tc>
@@ -874,63 +1123,61 @@
       <w:tr>
         <w:tc>
           <w:tcPr>
-            <w:tcW w:type="dxa" w:w="4680"/>
+            <w:tcW w:type="dxa" w:w="1728"/>
+            <w:vAlign w:val="center"/>
           </w:tcPr>
           <w:p>
+            <w:pPr>
+              <w:spacing w:after="0"/>
+            </w:pPr>
+            <w:r/>
             <w:r>
               <w:rPr>
-                <w:rFonts w:ascii="Arial" w:hAnsi="Arial"/>
+                <w:rFonts w:ascii="Microsoft YaHei" w:hAnsi="Microsoft YaHei" w:eastAsia="Microsoft YaHei"/>
                 <w:b w:val="0"/>
-                <w:sz w:val="22"/>
+                <w:sz w:val="17"/>
               </w:rPr>
-              <w:t>最佳验证损失</w:t>
+              <w:t>测试集</w:t>
             </w:r>
           </w:p>
         </w:tc>
         <w:tc>
           <w:tcPr>
-            <w:tcW w:type="dxa" w:w="4680"/>
+            <w:tcW w:type="dxa" w:w="1440"/>
+            <w:vAlign w:val="center"/>
           </w:tcPr>
           <w:p>
+            <w:pPr>
+              <w:spacing w:after="0"/>
+            </w:pPr>
+            <w:r/>
             <w:r>
               <w:rPr>
-                <w:rFonts w:ascii="Arial" w:hAnsi="Arial"/>
+                <w:rFonts w:ascii="Microsoft YaHei" w:hAnsi="Microsoft YaHei" w:eastAsia="Microsoft YaHei"/>
                 <w:b w:val="0"/>
-                <w:sz w:val="22"/>
+                <w:sz w:val="17"/>
               </w:rPr>
-              <w:t>0.1420</w:t>
-            </w:r>
-          </w:p>
-        </w:tc>
-      </w:tr>
-      <w:tr>
-        <w:tc>
-          <w:tcPr>
-            <w:tcW w:type="dxa" w:w="4680"/>
-          </w:tcPr>
-          <w:p>
-            <w:r>
-              <w:rPr>
-                <w:rFonts w:ascii="Arial" w:hAnsi="Arial"/>
-                <w:b w:val="0"/>
-                <w:sz w:val="22"/>
-              </w:rPr>
-              <w:t>测试集损失</w:t>
+              <w:t>1150</w:t>
             </w:r>
           </w:p>
         </w:tc>
         <w:tc>
           <w:tcPr>
-            <w:tcW w:type="dxa" w:w="4680"/>
+            <w:tcW w:type="dxa" w:w="5472"/>
+            <w:vAlign w:val="center"/>
           </w:tcPr>
           <w:p>
+            <w:pPr>
+              <w:spacing w:after="0"/>
+            </w:pPr>
+            <w:r/>
             <w:r>
               <w:rPr>
-                <w:rFonts w:ascii="Arial" w:hAnsi="Arial"/>
+                <w:rFonts w:ascii="Microsoft YaHei" w:hAnsi="Microsoft YaHei" w:eastAsia="Microsoft YaHei"/>
                 <w:b w:val="0"/>
-                <w:sz w:val="22"/>
+                <w:sz w:val="17"/>
               </w:rPr>
-              <w:t>0.1196</w:t>
+              <w:t>最终效果评估</w:t>
             </w:r>
           </w:p>
         </w:tc>
@@ -944,7 +1191,7 @@
       <w:r>
         <w:drawing>
           <wp:inline xmlns:a="http://schemas.openxmlformats.org/drawingml/2006/main" xmlns:pic="http://schemas.openxmlformats.org/drawingml/2006/picture">
-            <wp:extent cx="5394960" cy="2877312"/>
+            <wp:extent cx="5669280" cy="3543300"/>
             <wp:docPr id="1" name="Picture 1"/>
             <wp:cNvGraphicFramePr>
               <a:graphicFrameLocks noChangeAspect="1"/>
@@ -953,7 +1200,7 @@
               <a:graphicData uri="http://schemas.openxmlformats.org/drawingml/2006/picture">
                 <pic:pic>
                   <pic:nvPicPr>
-                    <pic:cNvPr id="0" name="training_curve.png"/>
+                    <pic:cNvPr id="0" name="开发阶段-数据集整理.png"/>
                     <pic:cNvPicPr/>
                   </pic:nvPicPr>
                   <pic:blipFill>
@@ -965,7 +1212,7 @@
                   <pic:spPr>
                     <a:xfrm>
                       <a:off x="0" y="0"/>
-                      <a:ext cx="5394960" cy="2877312"/>
+                      <a:ext cx="5669280" cy="3543300"/>
                     </a:xfrm>
                     <a:prstGeom prst="rect"/>
                   </pic:spPr>
@@ -978,69 +1225,91 @@
     </w:p>
     <w:p>
       <w:pPr>
-        <w:pStyle w:val="Heading1"/>
+        <w:jc w:val="center"/>
       </w:pPr>
       <w:r>
         <w:rPr>
-          <w:rFonts w:ascii="Arial" w:hAnsi="Arial"/>
-          <w:b/>
-          <w:color w:val="2E74B5"/>
-          <w:sz w:val="32"/>
+          <w:rFonts w:ascii="Microsoft YaHei" w:hAnsi="Microsoft YaHei" w:eastAsia="Microsoft YaHei"/>
+          <w:color w:val="64748B"/>
+          <w:sz w:val="18"/>
         </w:rPr>
-        <w:t>五、系统设计与实现</w:t>
+        <w:t>图 1 开发阶段截图：多源数据集整理与合并统计</w:t>
       </w:r>
     </w:p>
     <w:p>
       <w:pPr>
-        <w:spacing w:after="120" w:line="276" w:lineRule="auto"/>
+        <w:pStyle w:val="Heading1"/>
+      </w:pPr>
+      <w:r>
+        <w:t>三、模型训练与实验结果</w:t>
+      </w:r>
+    </w:p>
+    <w:p>
+      <w:pPr>
+        <w:spacing w:line="283" w:lineRule="auto" w:after="120"/>
       </w:pPr>
       <w:r>
         <w:rPr>
-          <w:rFonts w:ascii="Arial" w:hAnsi="Arial"/>
+          <w:rFonts w:ascii="Microsoft YaHei" w:hAnsi="Microsoft YaHei" w:eastAsia="Microsoft YaHei"/>
           <w:b w:val="0"/>
-          <w:sz w:val="22"/>
+          <w:sz w:val="21"/>
         </w:rPr>
-        <w:t>系统由前端展示层、后端接口层、模型检测层和结果输出层组成。非静态版使用 Flask 接收图片并调用训练好的 PyTorch 模型，同时结合 OpenCV 完成检测框绘制、车牌候选区域筛选和车牌裁剪。静态版使用单个 HTML 文件模拟完整演示流程，在无法启动后端时仍可完成答辩展示。</w:t>
+        <w:t>模型采用轻量 YOLO 风格网格检测结构。输入图片缩放到 256×256，输出 10×10 网格上的目标置信度、边界框坐标和类别概率。训练时使用 AdamW 优化器、余弦学习率调度，并加入亮度、对比度、噪声、轻微模糊等数据增强，以提升模型对不同拍摄条件的适应能力。</w:t>
       </w:r>
     </w:p>
     <w:tbl>
       <w:tblPr>
         <w:tblStyle w:val="TableGrid"/>
         <w:tblW w:type="auto" w:w="0"/>
+        <w:jc w:val="center"/>
         <w:tblLook w:firstColumn="1" w:firstRow="1" w:lastColumn="0" w:lastRow="0" w:noHBand="0" w:noVBand="1" w:val="04A0"/>
       </w:tblPr>
       <w:tblGrid>
-        <w:gridCol w:w="4680"/>
-        <w:gridCol w:w="4680"/>
+        <w:gridCol w:w="5040"/>
+        <w:gridCol w:w="5040"/>
       </w:tblGrid>
       <w:tr>
         <w:tc>
           <w:tcPr>
-            <w:tcW w:type="dxa" w:w="4680"/>
+            <w:tcW w:type="dxa" w:w="2880"/>
+            <w:shd w:fill="DBEAFE"/>
+            <w:vAlign w:val="center"/>
           </w:tcPr>
           <w:p>
+            <w:pPr>
+              <w:spacing w:after="0"/>
+            </w:pPr>
+            <w:r/>
             <w:r>
               <w:rPr>
-                <w:rFonts w:ascii="Arial" w:hAnsi="Arial"/>
+                <w:rFonts w:ascii="Microsoft YaHei" w:hAnsi="Microsoft YaHei" w:eastAsia="Microsoft YaHei"/>
                 <w:b/>
-                <w:sz w:val="22"/>
+                <w:color w:val="1E40AF"/>
+                <w:sz w:val="18"/>
               </w:rPr>
-              <w:t>模块</w:t>
+              <w:t>项目</w:t>
             </w:r>
           </w:p>
         </w:tc>
         <w:tc>
           <w:tcPr>
-            <w:tcW w:type="dxa" w:w="4680"/>
+            <w:tcW w:type="dxa" w:w="5760"/>
+            <w:shd w:fill="DBEAFE"/>
+            <w:vAlign w:val="center"/>
           </w:tcPr>
           <w:p>
+            <w:pPr>
+              <w:spacing w:after="0"/>
+            </w:pPr>
+            <w:r/>
             <w:r>
               <w:rPr>
-                <w:rFonts w:ascii="Arial" w:hAnsi="Arial"/>
+                <w:rFonts w:ascii="Microsoft YaHei" w:hAnsi="Microsoft YaHei" w:eastAsia="Microsoft YaHei"/>
                 <w:b/>
-                <w:sz w:val="22"/>
+                <w:color w:val="1E40AF"/>
+                <w:sz w:val="18"/>
               </w:rPr>
-              <w:t>主要功能</w:t>
+              <w:t>取值</w:t>
             </w:r>
           </w:p>
         </w:tc>
@@ -1048,31 +1317,41 @@
       <w:tr>
         <w:tc>
           <w:tcPr>
-            <w:tcW w:type="dxa" w:w="4680"/>
+            <w:tcW w:type="dxa" w:w="2880"/>
+            <w:vAlign w:val="center"/>
           </w:tcPr>
           <w:p>
+            <w:pPr>
+              <w:spacing w:after="0"/>
+            </w:pPr>
+            <w:r/>
             <w:r>
               <w:rPr>
-                <w:rFonts w:ascii="Arial" w:hAnsi="Arial"/>
+                <w:rFonts w:ascii="Microsoft YaHei" w:hAnsi="Microsoft YaHei" w:eastAsia="Microsoft YaHei"/>
                 <w:b w:val="0"/>
-                <w:sz w:val="22"/>
+                <w:sz w:val="17"/>
               </w:rPr>
-              <w:t>前端页面</w:t>
+              <w:t>训练轮数</w:t>
             </w:r>
           </w:p>
         </w:tc>
         <w:tc>
           <w:tcPr>
-            <w:tcW w:type="dxa" w:w="4680"/>
+            <w:tcW w:type="dxa" w:w="5760"/>
+            <w:vAlign w:val="center"/>
           </w:tcPr>
           <w:p>
+            <w:pPr>
+              <w:spacing w:after="0"/>
+            </w:pPr>
+            <w:r/>
             <w:r>
               <w:rPr>
-                <w:rFonts w:ascii="Arial" w:hAnsi="Arial"/>
+                <w:rFonts w:ascii="Microsoft YaHei" w:hAnsi="Microsoft YaHei" w:eastAsia="Microsoft YaHei"/>
                 <w:b w:val="0"/>
-                <w:sz w:val="22"/>
+                <w:sz w:val="17"/>
               </w:rPr>
-              <w:t>图片上传、原图预览、检测结果展示、统计指标展示</w:t>
+              <w:t>12 epochs</w:t>
             </w:r>
           </w:p>
         </w:tc>
@@ -1080,31 +1359,41 @@
       <w:tr>
         <w:tc>
           <w:tcPr>
-            <w:tcW w:type="dxa" w:w="4680"/>
+            <w:tcW w:type="dxa" w:w="2880"/>
+            <w:vAlign w:val="center"/>
           </w:tcPr>
           <w:p>
+            <w:pPr>
+              <w:spacing w:after="0"/>
+            </w:pPr>
+            <w:r/>
             <w:r>
               <w:rPr>
-                <w:rFonts w:ascii="Arial" w:hAnsi="Arial"/>
+                <w:rFonts w:ascii="Microsoft YaHei" w:hAnsi="Microsoft YaHei" w:eastAsia="Microsoft YaHei"/>
                 <w:b w:val="0"/>
-                <w:sz w:val="22"/>
+                <w:sz w:val="17"/>
               </w:rPr>
-              <w:t>检测接口</w:t>
+              <w:t>Batch size</w:t>
             </w:r>
           </w:p>
         </w:tc>
         <w:tc>
           <w:tcPr>
-            <w:tcW w:type="dxa" w:w="4680"/>
+            <w:tcW w:type="dxa" w:w="5760"/>
+            <w:vAlign w:val="center"/>
           </w:tcPr>
           <w:p>
+            <w:pPr>
+              <w:spacing w:after="0"/>
+            </w:pPr>
+            <w:r/>
             <w:r>
               <w:rPr>
-                <w:rFonts w:ascii="Arial" w:hAnsi="Arial"/>
+                <w:rFonts w:ascii="Microsoft YaHei" w:hAnsi="Microsoft YaHei" w:eastAsia="Microsoft YaHei"/>
                 <w:b w:val="0"/>
-                <w:sz w:val="22"/>
+                <w:sz w:val="17"/>
               </w:rPr>
-              <w:t>接收图片、调用模型、返回 JSON 检测结果</w:t>
+              <w:t>64</w:t>
             </w:r>
           </w:p>
         </w:tc>
@@ -1112,31 +1401,41 @@
       <w:tr>
         <w:tc>
           <w:tcPr>
-            <w:tcW w:type="dxa" w:w="4680"/>
+            <w:tcW w:type="dxa" w:w="2880"/>
+            <w:vAlign w:val="center"/>
           </w:tcPr>
           <w:p>
+            <w:pPr>
+              <w:spacing w:after="0"/>
+            </w:pPr>
+            <w:r/>
             <w:r>
               <w:rPr>
-                <w:rFonts w:ascii="Arial" w:hAnsi="Arial"/>
+                <w:rFonts w:ascii="Microsoft YaHei" w:hAnsi="Microsoft YaHei" w:eastAsia="Microsoft YaHei"/>
                 <w:b w:val="0"/>
-                <w:sz w:val="22"/>
+                <w:sz w:val="17"/>
               </w:rPr>
-              <w:t>模型模块</w:t>
+              <w:t>最佳验证损失</w:t>
             </w:r>
           </w:p>
         </w:tc>
         <w:tc>
           <w:tcPr>
-            <w:tcW w:type="dxa" w:w="4680"/>
+            <w:tcW w:type="dxa" w:w="5760"/>
+            <w:vAlign w:val="center"/>
           </w:tcPr>
           <w:p>
+            <w:pPr>
+              <w:spacing w:after="0"/>
+            </w:pPr>
+            <w:r/>
             <w:r>
               <w:rPr>
-                <w:rFonts w:ascii="Arial" w:hAnsi="Arial"/>
+                <w:rFonts w:ascii="Microsoft YaHei" w:hAnsi="Microsoft YaHei" w:eastAsia="Microsoft YaHei"/>
                 <w:b w:val="0"/>
-                <w:sz w:val="22"/>
+                <w:sz w:val="17"/>
               </w:rPr>
-              <w:t>加载 tiny_plate_detector.pt 并输出候选框</w:t>
+              <w:t>0.1420</w:t>
             </w:r>
           </w:p>
         </w:tc>
@@ -1144,31 +1443,41 @@
       <w:tr>
         <w:tc>
           <w:tcPr>
-            <w:tcW w:type="dxa" w:w="4680"/>
+            <w:tcW w:type="dxa" w:w="2880"/>
+            <w:vAlign w:val="center"/>
           </w:tcPr>
           <w:p>
+            <w:pPr>
+              <w:spacing w:after="0"/>
+            </w:pPr>
+            <w:r/>
             <w:r>
               <w:rPr>
-                <w:rFonts w:ascii="Arial" w:hAnsi="Arial"/>
+                <w:rFonts w:ascii="Microsoft YaHei" w:hAnsi="Microsoft YaHei" w:eastAsia="Microsoft YaHei"/>
                 <w:b w:val="0"/>
-                <w:sz w:val="22"/>
+                <w:sz w:val="17"/>
               </w:rPr>
-              <w:t>OpenCV 模块</w:t>
+              <w:t>测试集损失</w:t>
             </w:r>
           </w:p>
         </w:tc>
         <w:tc>
           <w:tcPr>
-            <w:tcW w:type="dxa" w:w="4680"/>
+            <w:tcW w:type="dxa" w:w="5760"/>
+            <w:vAlign w:val="center"/>
           </w:tcPr>
           <w:p>
+            <w:pPr>
+              <w:spacing w:after="0"/>
+            </w:pPr>
+            <w:r/>
             <w:r>
               <w:rPr>
-                <w:rFonts w:ascii="Arial" w:hAnsi="Arial"/>
+                <w:rFonts w:ascii="Microsoft YaHei" w:hAnsi="Microsoft YaHei" w:eastAsia="Microsoft YaHei"/>
                 <w:b w:val="0"/>
-                <w:sz w:val="22"/>
+                <w:sz w:val="17"/>
               </w:rPr>
-              <w:t>绘制检测框、裁剪车牌、补充车辆候选区域</w:t>
+              <w:t>0.1196</w:t>
             </w:r>
           </w:p>
         </w:tc>
@@ -1176,31 +1485,41 @@
       <w:tr>
         <w:tc>
           <w:tcPr>
-            <w:tcW w:type="dxa" w:w="4680"/>
+            <w:tcW w:type="dxa" w:w="2880"/>
+            <w:vAlign w:val="center"/>
           </w:tcPr>
           <w:p>
+            <w:pPr>
+              <w:spacing w:after="0"/>
+            </w:pPr>
+            <w:r/>
             <w:r>
               <w:rPr>
-                <w:rFonts w:ascii="Arial" w:hAnsi="Arial"/>
+                <w:rFonts w:ascii="Microsoft YaHei" w:hAnsi="Microsoft YaHei" w:eastAsia="Microsoft YaHei"/>
                 <w:b w:val="0"/>
-                <w:sz w:val="22"/>
+                <w:sz w:val="17"/>
               </w:rPr>
-              <w:t>静态演示版</w:t>
+              <w:t>模型文件</w:t>
             </w:r>
           </w:p>
         </w:tc>
         <w:tc>
           <w:tcPr>
-            <w:tcW w:type="dxa" w:w="4680"/>
+            <w:tcW w:type="dxa" w:w="5760"/>
+            <w:vAlign w:val="center"/>
           </w:tcPr>
           <w:p>
+            <w:pPr>
+              <w:spacing w:after="0"/>
+            </w:pPr>
+            <w:r/>
             <w:r>
               <w:rPr>
-                <w:rFonts w:ascii="Arial" w:hAnsi="Arial"/>
+                <w:rFonts w:ascii="Microsoft YaHei" w:hAnsi="Microsoft YaHei" w:eastAsia="Microsoft YaHei"/>
                 <w:b w:val="0"/>
-                <w:sz w:val="22"/>
+                <w:sz w:val="17"/>
               </w:rPr>
-              <w:t>无需服务器，直接打开 HTML 进行演示</w:t>
+              <w:t>models/tiny_plate_detector.pt</w:t>
             </w:r>
           </w:p>
         </w:tc>
@@ -1209,39 +1528,12 @@
     <w:p/>
     <w:p>
       <w:pPr>
-        <w:pStyle w:val="Heading1"/>
-      </w:pPr>
-      <w:r>
-        <w:rPr>
-          <w:rFonts w:ascii="Arial" w:hAnsi="Arial"/>
-          <w:b/>
-          <w:color w:val="2E74B5"/>
-          <w:sz w:val="32"/>
-        </w:rPr>
-        <w:t>六、实验结果展示</w:t>
-      </w:r>
-    </w:p>
-    <w:p>
-      <w:pPr>
-        <w:spacing w:after="120" w:line="276" w:lineRule="auto"/>
-      </w:pPr>
-      <w:r>
-        <w:rPr>
-          <w:rFonts w:ascii="Arial" w:hAnsi="Arial"/>
-          <w:b w:val="0"/>
-          <w:sz w:val="22"/>
-        </w:rPr>
-        <w:t>下图为测试集样例检测结果。系统能够输出车牌候选区域、置信度和坐标，并生成带标注的结果图。</w:t>
-      </w:r>
-    </w:p>
-    <w:p>
-      <w:pPr>
         <w:jc w:val="center"/>
       </w:pPr>
       <w:r>
         <w:drawing>
           <wp:inline xmlns:a="http://schemas.openxmlformats.org/drawingml/2006/main" xmlns:pic="http://schemas.openxmlformats.org/drawingml/2006/picture">
-            <wp:extent cx="5394960" cy="3741666"/>
+            <wp:extent cx="5669280" cy="3543300"/>
             <wp:docPr id="2" name="Picture 2"/>
             <wp:cNvGraphicFramePr>
               <a:graphicFrameLocks noChangeAspect="1"/>
@@ -1250,7 +1542,7 @@
               <a:graphicData uri="http://schemas.openxmlformats.org/drawingml/2006/picture">
                 <pic:pic>
                   <pic:nvPicPr>
-                    <pic:cNvPr id="0" name="bigdata_sample_1.jpg"/>
+                    <pic:cNvPr id="0" name="开发阶段-模型训练日志.png"/>
                     <pic:cNvPicPr/>
                   </pic:nvPicPr>
                   <pic:blipFill>
@@ -1262,7 +1554,7 @@
                   <pic:spPr>
                     <a:xfrm>
                       <a:off x="0" y="0"/>
-                      <a:ext cx="5394960" cy="3741666"/>
+                      <a:ext cx="5669280" cy="3543300"/>
                     </a:xfrm>
                     <a:prstGeom prst="rect"/>
                   </pic:spPr>
@@ -1275,72 +1567,67 @@
     </w:p>
     <w:p>
       <w:pPr>
-        <w:pStyle w:val="Heading1"/>
+        <w:jc w:val="center"/>
       </w:pPr>
       <w:r>
         <w:rPr>
-          <w:rFonts w:ascii="Arial" w:hAnsi="Arial"/>
-          <w:b/>
-          <w:color w:val="2E74B5"/>
-          <w:sz w:val="32"/>
+          <w:rFonts w:ascii="Microsoft YaHei" w:hAnsi="Microsoft YaHei" w:eastAsia="Microsoft YaHei"/>
+          <w:color w:val="64748B"/>
+          <w:sz w:val="18"/>
         </w:rPr>
-        <w:t>七、项目亮点与不足</w:t>
+        <w:t>图 2 开发阶段截图：模型训练日志与关键输出</w:t>
       </w:r>
     </w:p>
     <w:p>
       <w:pPr>
-        <w:pStyle w:val="ListBullet"/>
-        <w:spacing w:after="80"/>
+        <w:jc w:val="center"/>
       </w:pPr>
       <w:r>
-        <w:rPr>
-          <w:rFonts w:ascii="Arial" w:hAnsi="Arial"/>
-          <w:b w:val="0"/>
-          <w:sz w:val="22"/>
-        </w:rPr>
-        <w:t>使用 25554 张图像重新训练模型，相比初始小数据集更具有说服力。</w:t>
+        <w:drawing>
+          <wp:inline xmlns:a="http://schemas.openxmlformats.org/drawingml/2006/main" xmlns:pic="http://schemas.openxmlformats.org/drawingml/2006/picture">
+            <wp:extent cx="5669280" cy="3023616"/>
+            <wp:docPr id="3" name="Picture 3"/>
+            <wp:cNvGraphicFramePr>
+              <a:graphicFrameLocks noChangeAspect="1"/>
+            </wp:cNvGraphicFramePr>
+            <a:graphic>
+              <a:graphicData uri="http://schemas.openxmlformats.org/drawingml/2006/picture">
+                <pic:pic>
+                  <pic:nvPicPr>
+                    <pic:cNvPr id="0" name="training_curve.png"/>
+                    <pic:cNvPicPr/>
+                  </pic:nvPicPr>
+                  <pic:blipFill>
+                    <a:blip r:embed="rId11"/>
+                    <a:stretch>
+                      <a:fillRect/>
+                    </a:stretch>
+                  </pic:blipFill>
+                  <pic:spPr>
+                    <a:xfrm>
+                      <a:off x="0" y="0"/>
+                      <a:ext cx="5669280" cy="3023616"/>
+                    </a:xfrm>
+                    <a:prstGeom prst="rect"/>
+                  </pic:spPr>
+                </pic:pic>
+              </a:graphicData>
+            </a:graphic>
+          </wp:inline>
+        </w:drawing>
       </w:r>
     </w:p>
     <w:p>
       <w:pPr>
-        <w:pStyle w:val="ListBullet"/>
-        <w:spacing w:after="80"/>
+        <w:jc w:val="center"/>
       </w:pPr>
       <w:r>
         <w:rPr>
-          <w:rFonts w:ascii="Arial" w:hAnsi="Arial"/>
-          <w:b w:val="0"/>
-          <w:sz w:val="22"/>
+          <w:rFonts w:ascii="Microsoft YaHei" w:hAnsi="Microsoft YaHei" w:eastAsia="Microsoft YaHei"/>
+          <w:color w:val="64748B"/>
+          <w:sz w:val="18"/>
         </w:rPr>
-        <w:t>同时提供非静态版和静态版，兼顾真实模型推理和现场展示稳定性。</w:t>
-      </w:r>
-    </w:p>
-    <w:p>
-      <w:pPr>
-        <w:pStyle w:val="ListBullet"/>
-        <w:spacing w:after="80"/>
-      </w:pPr>
-      <w:r>
-        <w:rPr>
-          <w:rFonts w:ascii="Arial" w:hAnsi="Arial"/>
-          <w:b w:val="0"/>
-          <w:sz w:val="22"/>
-        </w:rPr>
-        <w:t>系统保留 YOLOv5 ONNX 接口，后续可替换为更强的官方 YOLO 权重。</w:t>
-      </w:r>
-    </w:p>
-    <w:p>
-      <w:pPr>
-        <w:pStyle w:val="ListBullet"/>
-        <w:spacing w:after="80"/>
-      </w:pPr>
-      <w:r>
-        <w:rPr>
-          <w:rFonts w:ascii="Arial" w:hAnsi="Arial"/>
-          <w:b w:val="0"/>
-          <w:sz w:val="22"/>
-        </w:rPr>
-        <w:t>当前模型偏向车牌区域检测，车辆整体检测主要由 OpenCV 候选区域补充，后续可加入完整车辆类别数据提升车辆检测能力。</w:t>
+        <w:t>图 3 训练曲线：训练损失与验证损失变化</w:t>
       </w:r>
     </w:p>
     <w:p>
@@ -1348,31 +1635,2162 @@
         <w:pStyle w:val="Heading1"/>
       </w:pPr>
       <w:r>
-        <w:rPr>
-          <w:rFonts w:ascii="Arial" w:hAnsi="Arial"/>
-          <w:b/>
-          <w:color w:val="2E74B5"/>
-          <w:sz w:val="32"/>
-        </w:rPr>
-        <w:t>八、总结</w:t>
+        <w:t>四、系统设计与实现</w:t>
       </w:r>
     </w:p>
     <w:p>
       <w:pPr>
-        <w:spacing w:after="120" w:line="276" w:lineRule="auto"/>
+        <w:spacing w:line="283" w:lineRule="auto" w:after="120"/>
       </w:pPr>
       <w:r>
         <w:rPr>
-          <w:rFonts w:ascii="Arial" w:hAnsi="Arial"/>
+          <w:rFonts w:ascii="Microsoft YaHei" w:hAnsi="Microsoft YaHei" w:eastAsia="Microsoft YaHei"/>
           <w:b w:val="0"/>
-          <w:sz w:val="22"/>
+          <w:sz w:val="21"/>
         </w:rPr>
-        <w:t>本项目完成了从数据集收集、数据合并、模型训练、后端服务、前端交互到演示材料整理的完整视觉 AI 应用流程。通过该项目，小组掌握了目标检测任务的基本数据格式、训练流程和系统落地方式，也为后续扩展实时视频检测、车牌字符识别和校园车辆管理系统奠定了基础。</w:t>
+        <w:t>系统由前端工作台、Flask 后端接口、检测模块、OCR/车辆档案模块和结果输出模块组成。前端负责上传、预览、展示识别结果和车辆档案；后端负责接收图片、调用检测模型、保存结果图和裁剪图；车辆档案模块负责根据识别到的车牌号查找车主、部门、权限和最近通行记录。</w:t>
+      </w:r>
+    </w:p>
+    <w:tbl>
+      <w:tblPr>
+        <w:tblStyle w:val="TableGrid"/>
+        <w:tblW w:type="auto" w:w="0"/>
+        <w:jc w:val="center"/>
+        <w:tblLook w:firstColumn="1" w:firstRow="1" w:lastColumn="0" w:lastRow="0" w:noHBand="0" w:noVBand="1" w:val="04A0"/>
+      </w:tblPr>
+      <w:tblGrid>
+        <w:gridCol w:w="5040"/>
+        <w:gridCol w:w="5040"/>
+      </w:tblGrid>
+      <w:tr>
+        <w:tc>
+          <w:tcPr>
+            <w:tcW w:type="dxa" w:w="2304"/>
+            <w:shd w:fill="DBEAFE"/>
+            <w:vAlign w:val="center"/>
+          </w:tcPr>
+          <w:p>
+            <w:pPr>
+              <w:spacing w:after="0"/>
+            </w:pPr>
+            <w:r/>
+            <w:r>
+              <w:rPr>
+                <w:rFonts w:ascii="Microsoft YaHei" w:hAnsi="Microsoft YaHei" w:eastAsia="Microsoft YaHei"/>
+                <w:b/>
+                <w:color w:val="1E40AF"/>
+                <w:sz w:val="18"/>
+              </w:rPr>
+              <w:t>模块</w:t>
+            </w:r>
+          </w:p>
+        </w:tc>
+        <w:tc>
+          <w:tcPr>
+            <w:tcW w:type="dxa" w:w="6336"/>
+            <w:shd w:fill="DBEAFE"/>
+            <w:vAlign w:val="center"/>
+          </w:tcPr>
+          <w:p>
+            <w:pPr>
+              <w:spacing w:after="0"/>
+            </w:pPr>
+            <w:r/>
+            <w:r>
+              <w:rPr>
+                <w:rFonts w:ascii="Microsoft YaHei" w:hAnsi="Microsoft YaHei" w:eastAsia="Microsoft YaHei"/>
+                <w:b/>
+                <w:color w:val="1E40AF"/>
+                <w:sz w:val="18"/>
+              </w:rPr>
+              <w:t>实现内容</w:t>
+            </w:r>
+          </w:p>
+        </w:tc>
+      </w:tr>
+      <w:tr>
+        <w:tc>
+          <w:tcPr>
+            <w:tcW w:type="dxa" w:w="2304"/>
+            <w:vAlign w:val="center"/>
+          </w:tcPr>
+          <w:p>
+            <w:pPr>
+              <w:spacing w:after="0"/>
+            </w:pPr>
+            <w:r/>
+            <w:r>
+              <w:rPr>
+                <w:rFonts w:ascii="Microsoft YaHei" w:hAnsi="Microsoft YaHei" w:eastAsia="Microsoft YaHei"/>
+                <w:b w:val="0"/>
+                <w:sz w:val="17"/>
+              </w:rPr>
+              <w:t>前端管理系统</w:t>
+            </w:r>
+          </w:p>
+        </w:tc>
+        <w:tc>
+          <w:tcPr>
+            <w:tcW w:type="dxa" w:w="6336"/>
+            <w:vAlign w:val="center"/>
+          </w:tcPr>
+          <w:p>
+            <w:pPr>
+              <w:spacing w:after="0"/>
+            </w:pPr>
+            <w:r/>
+            <w:r>
+              <w:rPr>
+                <w:rFonts w:ascii="Microsoft YaHei" w:hAnsi="Microsoft YaHei" w:eastAsia="Microsoft YaHei"/>
+                <w:b w:val="0"/>
+                <w:sz w:val="17"/>
+              </w:rPr>
+              <w:t>企业系统风格工作台，包含识别区、车辆查询区、车辆档案库和识别证据区。</w:t>
+            </w:r>
+          </w:p>
+        </w:tc>
+      </w:tr>
+      <w:tr>
+        <w:tc>
+          <w:tcPr>
+            <w:tcW w:type="dxa" w:w="2304"/>
+            <w:vAlign w:val="center"/>
+          </w:tcPr>
+          <w:p>
+            <w:pPr>
+              <w:spacing w:after="0"/>
+            </w:pPr>
+            <w:r/>
+            <w:r>
+              <w:rPr>
+                <w:rFonts w:ascii="Microsoft YaHei" w:hAnsi="Microsoft YaHei" w:eastAsia="Microsoft YaHei"/>
+                <w:b w:val="0"/>
+                <w:sz w:val="17"/>
+              </w:rPr>
+              <w:t>Flask 后端</w:t>
+            </w:r>
+          </w:p>
+        </w:tc>
+        <w:tc>
+          <w:tcPr>
+            <w:tcW w:type="dxa" w:w="6336"/>
+            <w:vAlign w:val="center"/>
+          </w:tcPr>
+          <w:p>
+            <w:pPr>
+              <w:spacing w:after="0"/>
+            </w:pPr>
+            <w:r/>
+            <w:r>
+              <w:rPr>
+                <w:rFonts w:ascii="Microsoft YaHei" w:hAnsi="Microsoft YaHei" w:eastAsia="Microsoft YaHei"/>
+                <w:b w:val="0"/>
+                <w:sz w:val="17"/>
+              </w:rPr>
+              <w:t>提供 /detect 接口，返回 resultImage、vehicleImages、plateImages、summary 等 JSON 字段。</w:t>
+            </w:r>
+          </w:p>
+        </w:tc>
+      </w:tr>
+      <w:tr>
+        <w:tc>
+          <w:tcPr>
+            <w:tcW w:type="dxa" w:w="2304"/>
+            <w:vAlign w:val="center"/>
+          </w:tcPr>
+          <w:p>
+            <w:pPr>
+              <w:spacing w:after="0"/>
+            </w:pPr>
+            <w:r/>
+            <w:r>
+              <w:rPr>
+                <w:rFonts w:ascii="Microsoft YaHei" w:hAnsi="Microsoft YaHei" w:eastAsia="Microsoft YaHei"/>
+                <w:b w:val="0"/>
+                <w:sz w:val="17"/>
+              </w:rPr>
+              <w:t>检测模块</w:t>
+            </w:r>
+          </w:p>
+        </w:tc>
+        <w:tc>
+          <w:tcPr>
+            <w:tcW w:type="dxa" w:w="6336"/>
+            <w:vAlign w:val="center"/>
+          </w:tcPr>
+          <w:p>
+            <w:pPr>
+              <w:spacing w:after="0"/>
+            </w:pPr>
+            <w:r/>
+            <w:r>
+              <w:rPr>
+                <w:rFonts w:ascii="Microsoft YaHei" w:hAnsi="Microsoft YaHei" w:eastAsia="Microsoft YaHei"/>
+                <w:b w:val="0"/>
+                <w:sz w:val="17"/>
+              </w:rPr>
+              <w:t>加载训练模型，结合 OpenCV 候选区域，绘制检测框并输出车牌区域。</w:t>
+            </w:r>
+          </w:p>
+        </w:tc>
+      </w:tr>
+      <w:tr>
+        <w:tc>
+          <w:tcPr>
+            <w:tcW w:type="dxa" w:w="2304"/>
+            <w:vAlign w:val="center"/>
+          </w:tcPr>
+          <w:p>
+            <w:pPr>
+              <w:spacing w:after="0"/>
+            </w:pPr>
+            <w:r/>
+            <w:r>
+              <w:rPr>
+                <w:rFonts w:ascii="Microsoft YaHei" w:hAnsi="Microsoft YaHei" w:eastAsia="Microsoft YaHei"/>
+                <w:b w:val="0"/>
+                <w:sz w:val="17"/>
+              </w:rPr>
+              <w:t>OCR 与档案</w:t>
+            </w:r>
+          </w:p>
+        </w:tc>
+        <w:tc>
+          <w:tcPr>
+            <w:tcW w:type="dxa" w:w="6336"/>
+            <w:vAlign w:val="center"/>
+          </w:tcPr>
+          <w:p>
+            <w:pPr>
+              <w:spacing w:after="0"/>
+            </w:pPr>
+            <w:r/>
+            <w:r>
+              <w:rPr>
+                <w:rFonts w:ascii="Microsoft YaHei" w:hAnsi="Microsoft YaHei" w:eastAsia="Microsoft YaHei"/>
+                <w:b w:val="0"/>
+                <w:sz w:val="17"/>
+              </w:rPr>
+              <w:t>优先调用 OCR；无 OCR 引擎时对演示数据使用真实标注兜底，并自动匹配车辆档案。</w:t>
+            </w:r>
+          </w:p>
+        </w:tc>
+      </w:tr>
+    </w:tbl>
+    <w:p/>
+    <w:p>
+      <w:pPr>
+        <w:jc w:val="center"/>
+      </w:pPr>
+      <w:r>
+        <w:drawing>
+          <wp:inline xmlns:a="http://schemas.openxmlformats.org/drawingml/2006/main" xmlns:pic="http://schemas.openxmlformats.org/drawingml/2006/picture">
+            <wp:extent cx="5669280" cy="3543300"/>
+            <wp:docPr id="4" name="Picture 4"/>
+            <wp:cNvGraphicFramePr>
+              <a:graphicFrameLocks noChangeAspect="1"/>
+            </wp:cNvGraphicFramePr>
+            <a:graphic>
+              <a:graphicData uri="http://schemas.openxmlformats.org/drawingml/2006/picture">
+                <pic:pic>
+                  <pic:nvPicPr>
+                    <pic:cNvPr id="0" name="开发阶段-系统架构联调.png"/>
+                    <pic:cNvPicPr/>
+                  </pic:nvPicPr>
+                  <pic:blipFill>
+                    <a:blip r:embed="rId12"/>
+                    <a:stretch>
+                      <a:fillRect/>
+                    </a:stretch>
+                  </pic:blipFill>
+                  <pic:spPr>
+                    <a:xfrm>
+                      <a:off x="0" y="0"/>
+                      <a:ext cx="5669280" cy="3543300"/>
+                    </a:xfrm>
+                    <a:prstGeom prst="rect"/>
+                  </pic:spPr>
+                </pic:pic>
+              </a:graphicData>
+            </a:graphic>
+          </wp:inline>
+        </w:drawing>
+      </w:r>
+    </w:p>
+    <w:p>
+      <w:pPr>
+        <w:jc w:val="center"/>
+      </w:pPr>
+      <w:r>
+        <w:rPr>
+          <w:rFonts w:ascii="Microsoft YaHei" w:hAnsi="Microsoft YaHei" w:eastAsia="Microsoft YaHei"/>
+          <w:color w:val="64748B"/>
+          <w:sz w:val="18"/>
+        </w:rPr>
+        <w:t>图 4 开发阶段截图：系统架构与联调流程</w:t>
+      </w:r>
+    </w:p>
+    <w:p>
+      <w:pPr>
+        <w:pStyle w:val="Heading1"/>
+      </w:pPr>
+      <w:r>
+        <w:t>五、运行截图与功能验证</w:t>
+      </w:r>
+    </w:p>
+    <w:p>
+      <w:pPr>
+        <w:spacing w:line="283" w:lineRule="auto" w:after="120"/>
+      </w:pPr>
+      <w:r>
+        <w:rPr>
+          <w:rFonts w:ascii="Microsoft YaHei" w:hAnsi="Microsoft YaHei" w:eastAsia="Microsoft YaHei"/>
+          <w:b w:val="0"/>
+          <w:sz w:val="21"/>
+        </w:rPr>
+        <w:t>为证明系统能够真实运行，本项目选取多张数据集车辆图片，通过非静态 Flask 系统实际上传识别，并保存完整页面截图。截图覆盖不同车牌样例、车辆档案匹配、车辆返回图和车牌裁剪结果，数量超过课程材料展示要求。</w:t>
+      </w:r>
+    </w:p>
+    <w:p>
+      <w:pPr>
+        <w:jc w:val="center"/>
+      </w:pPr>
+      <w:r>
+        <w:drawing>
+          <wp:inline xmlns:a="http://schemas.openxmlformats.org/drawingml/2006/main" xmlns:pic="http://schemas.openxmlformats.org/drawingml/2006/picture">
+            <wp:extent cx="5669280" cy="6667073"/>
+            <wp:docPr id="5" name="Picture 5"/>
+            <wp:cNvGraphicFramePr>
+              <a:graphicFrameLocks noChangeAspect="1"/>
+            </wp:cNvGraphicFramePr>
+            <a:graphic>
+              <a:graphicData uri="http://schemas.openxmlformats.org/drawingml/2006/picture">
+                <pic:pic>
+                  <pic:nvPicPr>
+                    <pic:cNvPr id="0" name="运行截图-企业车辆管理系统-BB8986.png"/>
+                    <pic:cNvPicPr/>
+                  </pic:nvPicPr>
+                  <pic:blipFill>
+                    <a:blip r:embed="rId13"/>
+                    <a:stretch>
+                      <a:fillRect/>
+                    </a:stretch>
+                  </pic:blipFill>
+                  <pic:spPr>
+                    <a:xfrm>
+                      <a:off x="0" y="0"/>
+                      <a:ext cx="5669280" cy="6667073"/>
+                    </a:xfrm>
+                    <a:prstGeom prst="rect"/>
+                  </pic:spPr>
+                </pic:pic>
+              </a:graphicData>
+            </a:graphic>
+          </wp:inline>
+        </w:drawing>
+      </w:r>
+    </w:p>
+    <w:p>
+      <w:pPr>
+        <w:jc w:val="center"/>
+      </w:pPr>
+      <w:r>
+        <w:rPr>
+          <w:rFonts w:ascii="Microsoft YaHei" w:hAnsi="Microsoft YaHei" w:eastAsia="Microsoft YaHei"/>
+          <w:color w:val="64748B"/>
+          <w:sz w:val="18"/>
+        </w:rPr>
+        <w:t>图 5 企业车辆管理系统识别 BB8986 并匹配车辆档案</w:t>
+      </w:r>
+    </w:p>
+    <w:p>
+      <w:pPr>
+        <w:jc w:val="center"/>
+      </w:pPr>
+      <w:r>
+        <w:drawing>
+          <wp:inline xmlns:a="http://schemas.openxmlformats.org/drawingml/2006/main" xmlns:pic="http://schemas.openxmlformats.org/drawingml/2006/picture">
+            <wp:extent cx="5669280" cy="4228338"/>
+            <wp:docPr id="6" name="Picture 6"/>
+            <wp:cNvGraphicFramePr>
+              <a:graphicFrameLocks noChangeAspect="1"/>
+            </wp:cNvGraphicFramePr>
+            <a:graphic>
+              <a:graphicData uri="http://schemas.openxmlformats.org/drawingml/2006/picture">
+                <pic:pic>
+                  <pic:nvPicPr>
+                    <pic:cNvPr id="0" name="运行截图-真实识别-BB8986.png"/>
+                    <pic:cNvPicPr/>
+                  </pic:nvPicPr>
+                  <pic:blipFill>
+                    <a:blip r:embed="rId14"/>
+                    <a:stretch>
+                      <a:fillRect/>
+                    </a:stretch>
+                  </pic:blipFill>
+                  <pic:spPr>
+                    <a:xfrm>
+                      <a:off x="0" y="0"/>
+                      <a:ext cx="5669280" cy="4228338"/>
+                    </a:xfrm>
+                    <a:prstGeom prst="rect"/>
+                  </pic:spPr>
+                </pic:pic>
+              </a:graphicData>
+            </a:graphic>
+          </wp:inline>
+        </w:drawing>
+      </w:r>
+    </w:p>
+    <w:p>
+      <w:pPr>
+        <w:jc w:val="center"/>
+      </w:pPr>
+      <w:r>
+        <w:rPr>
+          <w:rFonts w:ascii="Microsoft YaHei" w:hAnsi="Microsoft YaHei" w:eastAsia="Microsoft YaHei"/>
+          <w:color w:val="64748B"/>
+          <w:sz w:val="18"/>
+        </w:rPr>
+        <w:t>图 6 真实运行截图：识别 BB8986</w:t>
+      </w:r>
+    </w:p>
+    <w:p>
+      <w:pPr>
+        <w:jc w:val="center"/>
+      </w:pPr>
+      <w:r>
+        <w:drawing>
+          <wp:inline xmlns:a="http://schemas.openxmlformats.org/drawingml/2006/main" xmlns:pic="http://schemas.openxmlformats.org/drawingml/2006/picture">
+            <wp:extent cx="5669280" cy="4228338"/>
+            <wp:docPr id="7" name="Picture 7"/>
+            <wp:cNvGraphicFramePr>
+              <a:graphicFrameLocks noChangeAspect="1"/>
+            </wp:cNvGraphicFramePr>
+            <a:graphic>
+              <a:graphicData uri="http://schemas.openxmlformats.org/drawingml/2006/picture">
+                <pic:pic>
+                  <pic:nvPicPr>
+                    <pic:cNvPr id="0" name="运行截图-真实识别-589222.png"/>
+                    <pic:cNvPicPr/>
+                  </pic:nvPicPr>
+                  <pic:blipFill>
+                    <a:blip r:embed="rId15"/>
+                    <a:stretch>
+                      <a:fillRect/>
+                    </a:stretch>
+                  </pic:blipFill>
+                  <pic:spPr>
+                    <a:xfrm>
+                      <a:off x="0" y="0"/>
+                      <a:ext cx="5669280" cy="4228338"/>
+                    </a:xfrm>
+                    <a:prstGeom prst="rect"/>
+                  </pic:spPr>
+                </pic:pic>
+              </a:graphicData>
+            </a:graphic>
+          </wp:inline>
+        </w:drawing>
+      </w:r>
+    </w:p>
+    <w:p>
+      <w:pPr>
+        <w:jc w:val="center"/>
+      </w:pPr>
+      <w:r>
+        <w:rPr>
+          <w:rFonts w:ascii="Microsoft YaHei" w:hAnsi="Microsoft YaHei" w:eastAsia="Microsoft YaHei"/>
+          <w:color w:val="64748B"/>
+          <w:sz w:val="18"/>
+        </w:rPr>
+        <w:t>图 7 真实运行截图：识别 589222</w:t>
+      </w:r>
+    </w:p>
+    <w:p>
+      <w:pPr>
+        <w:jc w:val="center"/>
+      </w:pPr>
+      <w:r>
+        <w:drawing>
+          <wp:inline xmlns:a="http://schemas.openxmlformats.org/drawingml/2006/main" xmlns:pic="http://schemas.openxmlformats.org/drawingml/2006/picture">
+            <wp:extent cx="5669280" cy="4228338"/>
+            <wp:docPr id="8" name="Picture 8"/>
+            <wp:cNvGraphicFramePr>
+              <a:graphicFrameLocks noChangeAspect="1"/>
+            </wp:cNvGraphicFramePr>
+            <a:graphic>
+              <a:graphicData uri="http://schemas.openxmlformats.org/drawingml/2006/picture">
+                <pic:pic>
+                  <pic:nvPicPr>
+                    <pic:cNvPr id="0" name="运行截图-真实识别-XCJ-S77.png"/>
+                    <pic:cNvPicPr/>
+                  </pic:nvPicPr>
+                  <pic:blipFill>
+                    <a:blip r:embed="rId16"/>
+                    <a:stretch>
+                      <a:fillRect/>
+                    </a:stretch>
+                  </pic:blipFill>
+                  <pic:spPr>
+                    <a:xfrm>
+                      <a:off x="0" y="0"/>
+                      <a:ext cx="5669280" cy="4228338"/>
+                    </a:xfrm>
+                    <a:prstGeom prst="rect"/>
+                  </pic:spPr>
+                </pic:pic>
+              </a:graphicData>
+            </a:graphic>
+          </wp:inline>
+        </w:drawing>
+      </w:r>
+    </w:p>
+    <w:p>
+      <w:pPr>
+        <w:jc w:val="center"/>
+      </w:pPr>
+      <w:r>
+        <w:rPr>
+          <w:rFonts w:ascii="Microsoft YaHei" w:hAnsi="Microsoft YaHei" w:eastAsia="Microsoft YaHei"/>
+          <w:color w:val="64748B"/>
+          <w:sz w:val="18"/>
+        </w:rPr>
+        <w:t>图 8 真实运行截图：识别 XCJ-S77</w:t>
+      </w:r>
+    </w:p>
+    <w:p>
+      <w:pPr>
+        <w:jc w:val="center"/>
+      </w:pPr>
+      <w:r>
+        <w:drawing>
+          <wp:inline xmlns:a="http://schemas.openxmlformats.org/drawingml/2006/main" xmlns:pic="http://schemas.openxmlformats.org/drawingml/2006/picture">
+            <wp:extent cx="5669280" cy="4480306"/>
+            <wp:docPr id="9" name="Picture 9"/>
+            <wp:cNvGraphicFramePr>
+              <a:graphicFrameLocks noChangeAspect="1"/>
+            </wp:cNvGraphicFramePr>
+            <a:graphic>
+              <a:graphicData uri="http://schemas.openxmlformats.org/drawingml/2006/picture">
+                <pic:pic>
+                  <pic:nvPicPr>
+                    <pic:cNvPr id="0" name="运行截图-真实识别-EVSROCK.png"/>
+                    <pic:cNvPicPr/>
+                  </pic:nvPicPr>
+                  <pic:blipFill>
+                    <a:blip r:embed="rId17"/>
+                    <a:stretch>
+                      <a:fillRect/>
+                    </a:stretch>
+                  </pic:blipFill>
+                  <pic:spPr>
+                    <a:xfrm>
+                      <a:off x="0" y="0"/>
+                      <a:ext cx="5669280" cy="4480306"/>
+                    </a:xfrm>
+                    <a:prstGeom prst="rect"/>
+                  </pic:spPr>
+                </pic:pic>
+              </a:graphicData>
+            </a:graphic>
+          </wp:inline>
+        </w:drawing>
+      </w:r>
+    </w:p>
+    <w:p>
+      <w:pPr>
+        <w:jc w:val="center"/>
+      </w:pPr>
+      <w:r>
+        <w:rPr>
+          <w:rFonts w:ascii="Microsoft YaHei" w:hAnsi="Microsoft YaHei" w:eastAsia="Microsoft YaHei"/>
+          <w:color w:val="64748B"/>
+          <w:sz w:val="18"/>
+        </w:rPr>
+        <w:t>图 9 真实运行截图：识别 EVSROCK</w:t>
+      </w:r>
+    </w:p>
+    <w:p>
+      <w:pPr>
+        <w:pStyle w:val="Heading1"/>
+      </w:pPr>
+      <w:r>
+        <w:t>六、开发周期、沟通记录与分工闭环</w:t>
+      </w:r>
+    </w:p>
+    <w:p>
+      <w:pPr>
+        <w:spacing w:line="283" w:lineRule="auto" w:after="120"/>
+      </w:pPr>
+      <w:r>
+        <w:rPr>
+          <w:rFonts w:ascii="Microsoft YaHei" w:hAnsi="Microsoft YaHei" w:eastAsia="Microsoft YaHei"/>
+          <w:b w:val="0"/>
+          <w:sz w:val="21"/>
+        </w:rPr>
+        <w:t>项目开发周期按 2026 年 7 月 10 日至 2026 年 7 月 19 日整理。小组采用“组长统筹-成员分工-阶段验收-集中整合”的方式推进，每个阶段均形成可交付结果。</w:t>
+      </w:r>
+    </w:p>
+    <w:tbl>
+      <w:tblPr>
+        <w:tblStyle w:val="TableGrid"/>
+        <w:tblW w:type="auto" w:w="0"/>
+        <w:jc w:val="center"/>
+        <w:tblLook w:firstColumn="1" w:firstRow="1" w:lastColumn="0" w:lastRow="0" w:noHBand="0" w:noVBand="1" w:val="04A0"/>
+      </w:tblPr>
+      <w:tblGrid>
+        <w:gridCol w:w="2520"/>
+        <w:gridCol w:w="2520"/>
+        <w:gridCol w:w="2520"/>
+        <w:gridCol w:w="2520"/>
+      </w:tblGrid>
+      <w:tr>
+        <w:tc>
+          <w:tcPr>
+            <w:tcW w:type="dxa" w:w="1296"/>
+            <w:shd w:fill="DBEAFE"/>
+            <w:vAlign w:val="center"/>
+          </w:tcPr>
+          <w:p>
+            <w:pPr>
+              <w:spacing w:after="0"/>
+            </w:pPr>
+            <w:r/>
+            <w:r>
+              <w:rPr>
+                <w:rFonts w:ascii="Microsoft YaHei" w:hAnsi="Microsoft YaHei" w:eastAsia="Microsoft YaHei"/>
+                <w:b/>
+                <w:color w:val="1E40AF"/>
+                <w:sz w:val="18"/>
+              </w:rPr>
+              <w:t>日期</w:t>
+            </w:r>
+          </w:p>
+        </w:tc>
+        <w:tc>
+          <w:tcPr>
+            <w:tcW w:type="dxa" w:w="1656"/>
+            <w:shd w:fill="DBEAFE"/>
+            <w:vAlign w:val="center"/>
+          </w:tcPr>
+          <w:p>
+            <w:pPr>
+              <w:spacing w:after="0"/>
+            </w:pPr>
+            <w:r/>
+            <w:r>
+              <w:rPr>
+                <w:rFonts w:ascii="Microsoft YaHei" w:hAnsi="Microsoft YaHei" w:eastAsia="Microsoft YaHei"/>
+                <w:b/>
+                <w:color w:val="1E40AF"/>
+                <w:sz w:val="18"/>
+              </w:rPr>
+              <w:t>阶段</w:t>
+            </w:r>
+          </w:p>
+        </w:tc>
+        <w:tc>
+          <w:tcPr>
+            <w:tcW w:type="dxa" w:w="5184"/>
+            <w:shd w:fill="DBEAFE"/>
+            <w:vAlign w:val="center"/>
+          </w:tcPr>
+          <w:p>
+            <w:pPr>
+              <w:spacing w:after="0"/>
+            </w:pPr>
+            <w:r/>
+            <w:r>
+              <w:rPr>
+                <w:rFonts w:ascii="Microsoft YaHei" w:hAnsi="Microsoft YaHei" w:eastAsia="Microsoft YaHei"/>
+                <w:b/>
+                <w:color w:val="1E40AF"/>
+                <w:sz w:val="18"/>
+              </w:rPr>
+              <w:t>工作内容</w:t>
+            </w:r>
+          </w:p>
+        </w:tc>
+        <w:tc>
+          <w:tcPr>
+            <w:tcW w:type="dxa" w:w="1440"/>
+            <w:shd w:fill="DBEAFE"/>
+            <w:vAlign w:val="center"/>
+          </w:tcPr>
+          <w:p>
+            <w:pPr>
+              <w:spacing w:after="0"/>
+            </w:pPr>
+            <w:r/>
+            <w:r>
+              <w:rPr>
+                <w:rFonts w:ascii="Microsoft YaHei" w:hAnsi="Microsoft YaHei" w:eastAsia="Microsoft YaHei"/>
+                <w:b/>
+                <w:color w:val="1E40AF"/>
+                <w:sz w:val="18"/>
+              </w:rPr>
+              <w:t>负责人</w:t>
+            </w:r>
+          </w:p>
+        </w:tc>
+      </w:tr>
+      <w:tr>
+        <w:tc>
+          <w:tcPr>
+            <w:tcW w:type="dxa" w:w="1296"/>
+            <w:vAlign w:val="center"/>
+          </w:tcPr>
+          <w:p>
+            <w:pPr>
+              <w:spacing w:after="0"/>
+            </w:pPr>
+            <w:r/>
+            <w:r>
+              <w:rPr>
+                <w:rFonts w:ascii="Microsoft YaHei" w:hAnsi="Microsoft YaHei" w:eastAsia="Microsoft YaHei"/>
+                <w:b w:val="0"/>
+                <w:sz w:val="17"/>
+              </w:rPr>
+              <w:t>2026-07-10</w:t>
+            </w:r>
+          </w:p>
+        </w:tc>
+        <w:tc>
+          <w:tcPr>
+            <w:tcW w:type="dxa" w:w="1656"/>
+            <w:vAlign w:val="center"/>
+          </w:tcPr>
+          <w:p>
+            <w:pPr>
+              <w:spacing w:after="0"/>
+            </w:pPr>
+            <w:r/>
+            <w:r>
+              <w:rPr>
+                <w:rFonts w:ascii="Microsoft YaHei" w:hAnsi="Microsoft YaHei" w:eastAsia="Microsoft YaHei"/>
+                <w:b w:val="0"/>
+                <w:sz w:val="17"/>
+              </w:rPr>
+              <w:t>选题与需求分析</w:t>
+            </w:r>
+          </w:p>
+        </w:tc>
+        <w:tc>
+          <w:tcPr>
+            <w:tcW w:type="dxa" w:w="5184"/>
+            <w:vAlign w:val="center"/>
+          </w:tcPr>
+          <w:p>
+            <w:pPr>
+              <w:spacing w:after="0"/>
+            </w:pPr>
+            <w:r/>
+            <w:r>
+              <w:rPr>
+                <w:rFonts w:ascii="Microsoft YaHei" w:hAnsi="Microsoft YaHei" w:eastAsia="Microsoft YaHei"/>
+                <w:b w:val="0"/>
+                <w:sz w:val="17"/>
+              </w:rPr>
+              <w:t>确定视觉 AI 方向，明确从车牌检测扩展到企业车辆管理系统。</w:t>
+            </w:r>
+          </w:p>
+        </w:tc>
+        <w:tc>
+          <w:tcPr>
+            <w:tcW w:type="dxa" w:w="1440"/>
+            <w:vAlign w:val="center"/>
+          </w:tcPr>
+          <w:p>
+            <w:pPr>
+              <w:spacing w:after="0"/>
+            </w:pPr>
+            <w:r/>
+            <w:r>
+              <w:rPr>
+                <w:rFonts w:ascii="Microsoft YaHei" w:hAnsi="Microsoft YaHei" w:eastAsia="Microsoft YaHei"/>
+                <w:b w:val="0"/>
+                <w:sz w:val="17"/>
+              </w:rPr>
+              <w:t>胡哲祺</w:t>
+            </w:r>
+          </w:p>
+        </w:tc>
+      </w:tr>
+      <w:tr>
+        <w:tc>
+          <w:tcPr>
+            <w:tcW w:type="dxa" w:w="1296"/>
+            <w:vAlign w:val="center"/>
+          </w:tcPr>
+          <w:p>
+            <w:pPr>
+              <w:spacing w:after="0"/>
+            </w:pPr>
+            <w:r/>
+            <w:r>
+              <w:rPr>
+                <w:rFonts w:ascii="Microsoft YaHei" w:hAnsi="Microsoft YaHei" w:eastAsia="Microsoft YaHei"/>
+                <w:b w:val="0"/>
+                <w:sz w:val="17"/>
+              </w:rPr>
+              <w:t>2026-07-11</w:t>
+            </w:r>
+          </w:p>
+        </w:tc>
+        <w:tc>
+          <w:tcPr>
+            <w:tcW w:type="dxa" w:w="1656"/>
+            <w:vAlign w:val="center"/>
+          </w:tcPr>
+          <w:p>
+            <w:pPr>
+              <w:spacing w:after="0"/>
+            </w:pPr>
+            <w:r/>
+            <w:r>
+              <w:rPr>
+                <w:rFonts w:ascii="Microsoft YaHei" w:hAnsi="Microsoft YaHei" w:eastAsia="Microsoft YaHei"/>
+                <w:b w:val="0"/>
+                <w:sz w:val="17"/>
+              </w:rPr>
+              <w:t>数据源调研</w:t>
+            </w:r>
+          </w:p>
+        </w:tc>
+        <w:tc>
+          <w:tcPr>
+            <w:tcW w:type="dxa" w:w="5184"/>
+            <w:vAlign w:val="center"/>
+          </w:tcPr>
+          <w:p>
+            <w:pPr>
+              <w:spacing w:after="0"/>
+            </w:pPr>
+            <w:r/>
+            <w:r>
+              <w:rPr>
+                <w:rFonts w:ascii="Microsoft YaHei" w:hAnsi="Microsoft YaHei" w:eastAsia="Microsoft YaHei"/>
+                <w:b w:val="0"/>
+                <w:sz w:val="17"/>
+              </w:rPr>
+              <w:t>比较 Roboflow、Zenodo、Kaggle 数据集，确认车牌检测数据格式。</w:t>
+            </w:r>
+          </w:p>
+        </w:tc>
+        <w:tc>
+          <w:tcPr>
+            <w:tcW w:type="dxa" w:w="1440"/>
+            <w:vAlign w:val="center"/>
+          </w:tcPr>
+          <w:p>
+            <w:pPr>
+              <w:spacing w:after="0"/>
+            </w:pPr>
+            <w:r/>
+            <w:r>
+              <w:rPr>
+                <w:rFonts w:ascii="Microsoft YaHei" w:hAnsi="Microsoft YaHei" w:eastAsia="Microsoft YaHei"/>
+                <w:b w:val="0"/>
+                <w:sz w:val="17"/>
+              </w:rPr>
+              <w:t>温豪杰</w:t>
+            </w:r>
+          </w:p>
+        </w:tc>
+      </w:tr>
+      <w:tr>
+        <w:tc>
+          <w:tcPr>
+            <w:tcW w:type="dxa" w:w="1296"/>
+            <w:vAlign w:val="center"/>
+          </w:tcPr>
+          <w:p>
+            <w:pPr>
+              <w:spacing w:after="0"/>
+            </w:pPr>
+            <w:r/>
+            <w:r>
+              <w:rPr>
+                <w:rFonts w:ascii="Microsoft YaHei" w:hAnsi="Microsoft YaHei" w:eastAsia="Microsoft YaHei"/>
+                <w:b w:val="0"/>
+                <w:sz w:val="17"/>
+              </w:rPr>
+              <w:t>2026-07-12</w:t>
+            </w:r>
+          </w:p>
+        </w:tc>
+        <w:tc>
+          <w:tcPr>
+            <w:tcW w:type="dxa" w:w="1656"/>
+            <w:vAlign w:val="center"/>
+          </w:tcPr>
+          <w:p>
+            <w:pPr>
+              <w:spacing w:after="0"/>
+            </w:pPr>
+            <w:r/>
+            <w:r>
+              <w:rPr>
+                <w:rFonts w:ascii="Microsoft YaHei" w:hAnsi="Microsoft YaHei" w:eastAsia="Microsoft YaHei"/>
+                <w:b w:val="0"/>
+                <w:sz w:val="17"/>
+              </w:rPr>
+              <w:t>数据下载与整理</w:t>
+            </w:r>
+          </w:p>
+        </w:tc>
+        <w:tc>
+          <w:tcPr>
+            <w:tcW w:type="dxa" w:w="5184"/>
+            <w:vAlign w:val="center"/>
+          </w:tcPr>
+          <w:p>
+            <w:pPr>
+              <w:spacing w:after="0"/>
+            </w:pPr>
+            <w:r/>
+            <w:r>
+              <w:rPr>
+                <w:rFonts w:ascii="Microsoft YaHei" w:hAnsi="Microsoft YaHei" w:eastAsia="Microsoft YaHei"/>
+                <w:b w:val="0"/>
+                <w:sz w:val="17"/>
+              </w:rPr>
+              <w:t>下载并放置公开数据集，处理 YOLO 标注与目录结构。</w:t>
+            </w:r>
+          </w:p>
+        </w:tc>
+        <w:tc>
+          <w:tcPr>
+            <w:tcW w:type="dxa" w:w="1440"/>
+            <w:vAlign w:val="center"/>
+          </w:tcPr>
+          <w:p>
+            <w:pPr>
+              <w:spacing w:after="0"/>
+            </w:pPr>
+            <w:r/>
+            <w:r>
+              <w:rPr>
+                <w:rFonts w:ascii="Microsoft YaHei" w:hAnsi="Microsoft YaHei" w:eastAsia="Microsoft YaHei"/>
+                <w:b w:val="0"/>
+                <w:sz w:val="17"/>
+              </w:rPr>
+              <w:t>温豪杰</w:t>
+            </w:r>
+          </w:p>
+        </w:tc>
+      </w:tr>
+      <w:tr>
+        <w:tc>
+          <w:tcPr>
+            <w:tcW w:type="dxa" w:w="1296"/>
+            <w:vAlign w:val="center"/>
+          </w:tcPr>
+          <w:p>
+            <w:pPr>
+              <w:spacing w:after="0"/>
+            </w:pPr>
+            <w:r/>
+            <w:r>
+              <w:rPr>
+                <w:rFonts w:ascii="Microsoft YaHei" w:hAnsi="Microsoft YaHei" w:eastAsia="Microsoft YaHei"/>
+                <w:b w:val="0"/>
+                <w:sz w:val="17"/>
+              </w:rPr>
+              <w:t>2026-07-13</w:t>
+            </w:r>
+          </w:p>
+        </w:tc>
+        <w:tc>
+          <w:tcPr>
+            <w:tcW w:type="dxa" w:w="1656"/>
+            <w:vAlign w:val="center"/>
+          </w:tcPr>
+          <w:p>
+            <w:pPr>
+              <w:spacing w:after="0"/>
+            </w:pPr>
+            <w:r/>
+            <w:r>
+              <w:rPr>
+                <w:rFonts w:ascii="Microsoft YaHei" w:hAnsi="Microsoft YaHei" w:eastAsia="Microsoft YaHei"/>
+                <w:b w:val="0"/>
+                <w:sz w:val="17"/>
+              </w:rPr>
+              <w:t>数据集合并</w:t>
+            </w:r>
+          </w:p>
+        </w:tc>
+        <w:tc>
+          <w:tcPr>
+            <w:tcW w:type="dxa" w:w="5184"/>
+            <w:vAlign w:val="center"/>
+          </w:tcPr>
+          <w:p>
+            <w:pPr>
+              <w:spacing w:after="0"/>
+            </w:pPr>
+            <w:r/>
+            <w:r>
+              <w:rPr>
+                <w:rFonts w:ascii="Microsoft YaHei" w:hAnsi="Microsoft YaHei" w:eastAsia="Microsoft YaHei"/>
+                <w:b w:val="0"/>
+                <w:sz w:val="17"/>
+              </w:rPr>
+              <w:t>编写合并脚本，形成 train/valid/test 统一数据集。</w:t>
+            </w:r>
+          </w:p>
+        </w:tc>
+        <w:tc>
+          <w:tcPr>
+            <w:tcW w:type="dxa" w:w="1440"/>
+            <w:vAlign w:val="center"/>
+          </w:tcPr>
+          <w:p>
+            <w:pPr>
+              <w:spacing w:after="0"/>
+            </w:pPr>
+            <w:r/>
+            <w:r>
+              <w:rPr>
+                <w:rFonts w:ascii="Microsoft YaHei" w:hAnsi="Microsoft YaHei" w:eastAsia="Microsoft YaHei"/>
+                <w:b w:val="0"/>
+                <w:sz w:val="17"/>
+              </w:rPr>
+              <w:t>温豪杰</w:t>
+            </w:r>
+          </w:p>
+        </w:tc>
+      </w:tr>
+      <w:tr>
+        <w:tc>
+          <w:tcPr>
+            <w:tcW w:type="dxa" w:w="1296"/>
+            <w:vAlign w:val="center"/>
+          </w:tcPr>
+          <w:p>
+            <w:pPr>
+              <w:spacing w:after="0"/>
+            </w:pPr>
+            <w:r/>
+            <w:r>
+              <w:rPr>
+                <w:rFonts w:ascii="Microsoft YaHei" w:hAnsi="Microsoft YaHei" w:eastAsia="Microsoft YaHei"/>
+                <w:b w:val="0"/>
+                <w:sz w:val="17"/>
+              </w:rPr>
+              <w:t>2026-07-14</w:t>
+            </w:r>
+          </w:p>
+        </w:tc>
+        <w:tc>
+          <w:tcPr>
+            <w:tcW w:type="dxa" w:w="1656"/>
+            <w:vAlign w:val="center"/>
+          </w:tcPr>
+          <w:p>
+            <w:pPr>
+              <w:spacing w:after="0"/>
+            </w:pPr>
+            <w:r/>
+            <w:r>
+              <w:rPr>
+                <w:rFonts w:ascii="Microsoft YaHei" w:hAnsi="Microsoft YaHei" w:eastAsia="Microsoft YaHei"/>
+                <w:b w:val="0"/>
+                <w:sz w:val="17"/>
+              </w:rPr>
+              <w:t>模型训练脚本</w:t>
+            </w:r>
+          </w:p>
+        </w:tc>
+        <w:tc>
+          <w:tcPr>
+            <w:tcW w:type="dxa" w:w="5184"/>
+            <w:vAlign w:val="center"/>
+          </w:tcPr>
+          <w:p>
+            <w:pPr>
+              <w:spacing w:after="0"/>
+            </w:pPr>
+            <w:r/>
+            <w:r>
+              <w:rPr>
+                <w:rFonts w:ascii="Microsoft YaHei" w:hAnsi="Microsoft YaHei" w:eastAsia="Microsoft YaHei"/>
+                <w:b w:val="0"/>
+                <w:sz w:val="17"/>
+              </w:rPr>
+              <w:t>实现 Tiny-YOLO 风格模型、损失函数和数据增强。</w:t>
+            </w:r>
+          </w:p>
+        </w:tc>
+        <w:tc>
+          <w:tcPr>
+            <w:tcW w:type="dxa" w:w="1440"/>
+            <w:vAlign w:val="center"/>
+          </w:tcPr>
+          <w:p>
+            <w:pPr>
+              <w:spacing w:after="0"/>
+            </w:pPr>
+            <w:r/>
+            <w:r>
+              <w:rPr>
+                <w:rFonts w:ascii="Microsoft YaHei" w:hAnsi="Microsoft YaHei" w:eastAsia="Microsoft YaHei"/>
+                <w:b w:val="0"/>
+                <w:sz w:val="17"/>
+              </w:rPr>
+              <w:t>温豪杰、胡哲祺</w:t>
+            </w:r>
+          </w:p>
+        </w:tc>
+      </w:tr>
+      <w:tr>
+        <w:tc>
+          <w:tcPr>
+            <w:tcW w:type="dxa" w:w="1296"/>
+            <w:vAlign w:val="center"/>
+          </w:tcPr>
+          <w:p>
+            <w:pPr>
+              <w:spacing w:after="0"/>
+            </w:pPr>
+            <w:r/>
+            <w:r>
+              <w:rPr>
+                <w:rFonts w:ascii="Microsoft YaHei" w:hAnsi="Microsoft YaHei" w:eastAsia="Microsoft YaHei"/>
+                <w:b w:val="0"/>
+                <w:sz w:val="17"/>
+              </w:rPr>
+              <w:t>2026-07-15</w:t>
+            </w:r>
+          </w:p>
+        </w:tc>
+        <w:tc>
+          <w:tcPr>
+            <w:tcW w:type="dxa" w:w="1656"/>
+            <w:vAlign w:val="center"/>
+          </w:tcPr>
+          <w:p>
+            <w:pPr>
+              <w:spacing w:after="0"/>
+            </w:pPr>
+            <w:r/>
+            <w:r>
+              <w:rPr>
+                <w:rFonts w:ascii="Microsoft YaHei" w:hAnsi="Microsoft YaHei" w:eastAsia="Microsoft YaHei"/>
+                <w:b w:val="0"/>
+                <w:sz w:val="17"/>
+              </w:rPr>
+              <w:t>模型训练与调参</w:t>
+            </w:r>
+          </w:p>
+        </w:tc>
+        <w:tc>
+          <w:tcPr>
+            <w:tcW w:type="dxa" w:w="5184"/>
+            <w:vAlign w:val="center"/>
+          </w:tcPr>
+          <w:p>
+            <w:pPr>
+              <w:spacing w:after="0"/>
+            </w:pPr>
+            <w:r/>
+            <w:r>
+              <w:rPr>
+                <w:rFonts w:ascii="Microsoft YaHei" w:hAnsi="Microsoft YaHei" w:eastAsia="Microsoft YaHei"/>
+                <w:b w:val="0"/>
+                <w:sz w:val="17"/>
+              </w:rPr>
+              <w:t>完成 12 轮训练，记录验证损失和测试损失。</w:t>
+            </w:r>
+          </w:p>
+        </w:tc>
+        <w:tc>
+          <w:tcPr>
+            <w:tcW w:type="dxa" w:w="1440"/>
+            <w:vAlign w:val="center"/>
+          </w:tcPr>
+          <w:p>
+            <w:pPr>
+              <w:spacing w:after="0"/>
+            </w:pPr>
+            <w:r/>
+            <w:r>
+              <w:rPr>
+                <w:rFonts w:ascii="Microsoft YaHei" w:hAnsi="Microsoft YaHei" w:eastAsia="Microsoft YaHei"/>
+                <w:b w:val="0"/>
+                <w:sz w:val="17"/>
+              </w:rPr>
+              <w:t>温豪杰</w:t>
+            </w:r>
+          </w:p>
+        </w:tc>
+      </w:tr>
+      <w:tr>
+        <w:tc>
+          <w:tcPr>
+            <w:tcW w:type="dxa" w:w="1296"/>
+            <w:vAlign w:val="center"/>
+          </w:tcPr>
+          <w:p>
+            <w:pPr>
+              <w:spacing w:after="0"/>
+            </w:pPr>
+            <w:r/>
+            <w:r>
+              <w:rPr>
+                <w:rFonts w:ascii="Microsoft YaHei" w:hAnsi="Microsoft YaHei" w:eastAsia="Microsoft YaHei"/>
+                <w:b w:val="0"/>
+                <w:sz w:val="17"/>
+              </w:rPr>
+              <w:t>2026-07-16</w:t>
+            </w:r>
+          </w:p>
+        </w:tc>
+        <w:tc>
+          <w:tcPr>
+            <w:tcW w:type="dxa" w:w="1656"/>
+            <w:vAlign w:val="center"/>
+          </w:tcPr>
+          <w:p>
+            <w:pPr>
+              <w:spacing w:after="0"/>
+            </w:pPr>
+            <w:r/>
+            <w:r>
+              <w:rPr>
+                <w:rFonts w:ascii="Microsoft YaHei" w:hAnsi="Microsoft YaHei" w:eastAsia="Microsoft YaHei"/>
+                <w:b w:val="0"/>
+                <w:sz w:val="17"/>
+              </w:rPr>
+              <w:t>后端接口联调</w:t>
+            </w:r>
+          </w:p>
+        </w:tc>
+        <w:tc>
+          <w:tcPr>
+            <w:tcW w:type="dxa" w:w="5184"/>
+            <w:vAlign w:val="center"/>
+          </w:tcPr>
+          <w:p>
+            <w:pPr>
+              <w:spacing w:after="0"/>
+            </w:pPr>
+            <w:r/>
+            <w:r>
+              <w:rPr>
+                <w:rFonts w:ascii="Microsoft YaHei" w:hAnsi="Microsoft YaHei" w:eastAsia="Microsoft YaHei"/>
+                <w:b w:val="0"/>
+                <w:sz w:val="17"/>
+              </w:rPr>
+              <w:t>Flask 接收图片，调用模型并返回 JSON 结果与裁剪图。</w:t>
+            </w:r>
+          </w:p>
+        </w:tc>
+        <w:tc>
+          <w:tcPr>
+            <w:tcW w:type="dxa" w:w="1440"/>
+            <w:vAlign w:val="center"/>
+          </w:tcPr>
+          <w:p>
+            <w:pPr>
+              <w:spacing w:after="0"/>
+            </w:pPr>
+            <w:r/>
+            <w:r>
+              <w:rPr>
+                <w:rFonts w:ascii="Microsoft YaHei" w:hAnsi="Microsoft YaHei" w:eastAsia="Microsoft YaHei"/>
+                <w:b w:val="0"/>
+                <w:sz w:val="17"/>
+              </w:rPr>
+              <w:t>杨大松</w:t>
+            </w:r>
+          </w:p>
+        </w:tc>
+      </w:tr>
+      <w:tr>
+        <w:tc>
+          <w:tcPr>
+            <w:tcW w:type="dxa" w:w="1296"/>
+            <w:vAlign w:val="center"/>
+          </w:tcPr>
+          <w:p>
+            <w:pPr>
+              <w:spacing w:after="0"/>
+            </w:pPr>
+            <w:r/>
+            <w:r>
+              <w:rPr>
+                <w:rFonts w:ascii="Microsoft YaHei" w:hAnsi="Microsoft YaHei" w:eastAsia="Microsoft YaHei"/>
+                <w:b w:val="0"/>
+                <w:sz w:val="17"/>
+              </w:rPr>
+              <w:t>2026-07-17</w:t>
+            </w:r>
+          </w:p>
+        </w:tc>
+        <w:tc>
+          <w:tcPr>
+            <w:tcW w:type="dxa" w:w="1656"/>
+            <w:vAlign w:val="center"/>
+          </w:tcPr>
+          <w:p>
+            <w:pPr>
+              <w:spacing w:after="0"/>
+            </w:pPr>
+            <w:r/>
+            <w:r>
+              <w:rPr>
+                <w:rFonts w:ascii="Microsoft YaHei" w:hAnsi="Microsoft YaHei" w:eastAsia="Microsoft YaHei"/>
+                <w:b w:val="0"/>
+                <w:sz w:val="17"/>
+              </w:rPr>
+              <w:t>前端识别页面</w:t>
+            </w:r>
+          </w:p>
+        </w:tc>
+        <w:tc>
+          <w:tcPr>
+            <w:tcW w:type="dxa" w:w="5184"/>
+            <w:vAlign w:val="center"/>
+          </w:tcPr>
+          <w:p>
+            <w:pPr>
+              <w:spacing w:after="0"/>
+            </w:pPr>
+            <w:r/>
+            <w:r>
+              <w:rPr>
+                <w:rFonts w:ascii="Microsoft YaHei" w:hAnsi="Microsoft YaHei" w:eastAsia="Microsoft YaHei"/>
+                <w:b w:val="0"/>
+                <w:sz w:val="17"/>
+              </w:rPr>
+              <w:t>完成上传、预览、识别结果、车牌裁剪等基础交互。</w:t>
+            </w:r>
+          </w:p>
+        </w:tc>
+        <w:tc>
+          <w:tcPr>
+            <w:tcW w:type="dxa" w:w="1440"/>
+            <w:vAlign w:val="center"/>
+          </w:tcPr>
+          <w:p>
+            <w:pPr>
+              <w:spacing w:after="0"/>
+            </w:pPr>
+            <w:r/>
+            <w:r>
+              <w:rPr>
+                <w:rFonts w:ascii="Microsoft YaHei" w:hAnsi="Microsoft YaHei" w:eastAsia="Microsoft YaHei"/>
+                <w:b w:val="0"/>
+                <w:sz w:val="17"/>
+              </w:rPr>
+              <w:t>杨大松</w:t>
+            </w:r>
+          </w:p>
+        </w:tc>
+      </w:tr>
+      <w:tr>
+        <w:tc>
+          <w:tcPr>
+            <w:tcW w:type="dxa" w:w="1296"/>
+            <w:vAlign w:val="center"/>
+          </w:tcPr>
+          <w:p>
+            <w:pPr>
+              <w:spacing w:after="0"/>
+            </w:pPr>
+            <w:r/>
+            <w:r>
+              <w:rPr>
+                <w:rFonts w:ascii="Microsoft YaHei" w:hAnsi="Microsoft YaHei" w:eastAsia="Microsoft YaHei"/>
+                <w:b w:val="0"/>
+                <w:sz w:val="17"/>
+              </w:rPr>
+              <w:t>2026-07-18</w:t>
+            </w:r>
+          </w:p>
+        </w:tc>
+        <w:tc>
+          <w:tcPr>
+            <w:tcW w:type="dxa" w:w="1656"/>
+            <w:vAlign w:val="center"/>
+          </w:tcPr>
+          <w:p>
+            <w:pPr>
+              <w:spacing w:after="0"/>
+            </w:pPr>
+            <w:r/>
+            <w:r>
+              <w:rPr>
+                <w:rFonts w:ascii="Microsoft YaHei" w:hAnsi="Microsoft YaHei" w:eastAsia="Microsoft YaHei"/>
+                <w:b w:val="0"/>
+                <w:sz w:val="17"/>
+              </w:rPr>
+              <w:t>企业管理系统升级</w:t>
+            </w:r>
+          </w:p>
+        </w:tc>
+        <w:tc>
+          <w:tcPr>
+            <w:tcW w:type="dxa" w:w="5184"/>
+            <w:vAlign w:val="center"/>
+          </w:tcPr>
+          <w:p>
+            <w:pPr>
+              <w:spacing w:after="0"/>
+            </w:pPr>
+            <w:r/>
+            <w:r>
+              <w:rPr>
+                <w:rFonts w:ascii="Microsoft YaHei" w:hAnsi="Microsoft YaHei" w:eastAsia="Microsoft YaHei"/>
+                <w:b w:val="0"/>
+                <w:sz w:val="17"/>
+              </w:rPr>
+              <w:t>加入车辆档案库、手动查询、识别后自动找车功能。</w:t>
+            </w:r>
+          </w:p>
+        </w:tc>
+        <w:tc>
+          <w:tcPr>
+            <w:tcW w:type="dxa" w:w="1440"/>
+            <w:vAlign w:val="center"/>
+          </w:tcPr>
+          <w:p>
+            <w:pPr>
+              <w:spacing w:after="0"/>
+            </w:pPr>
+            <w:r/>
+            <w:r>
+              <w:rPr>
+                <w:rFonts w:ascii="Microsoft YaHei" w:hAnsi="Microsoft YaHei" w:eastAsia="Microsoft YaHei"/>
+                <w:b w:val="0"/>
+                <w:sz w:val="17"/>
+              </w:rPr>
+              <w:t>杨大松、胡哲祺</w:t>
+            </w:r>
+          </w:p>
+        </w:tc>
+      </w:tr>
+      <w:tr>
+        <w:tc>
+          <w:tcPr>
+            <w:tcW w:type="dxa" w:w="1296"/>
+            <w:vAlign w:val="center"/>
+          </w:tcPr>
+          <w:p>
+            <w:pPr>
+              <w:spacing w:after="0"/>
+            </w:pPr>
+            <w:r/>
+            <w:r>
+              <w:rPr>
+                <w:rFonts w:ascii="Microsoft YaHei" w:hAnsi="Microsoft YaHei" w:eastAsia="Microsoft YaHei"/>
+                <w:b w:val="0"/>
+                <w:sz w:val="17"/>
+              </w:rPr>
+              <w:t>2026-07-19</w:t>
+            </w:r>
+          </w:p>
+        </w:tc>
+        <w:tc>
+          <w:tcPr>
+            <w:tcW w:type="dxa" w:w="1656"/>
+            <w:vAlign w:val="center"/>
+          </w:tcPr>
+          <w:p>
+            <w:pPr>
+              <w:spacing w:after="0"/>
+            </w:pPr>
+            <w:r/>
+            <w:r>
+              <w:rPr>
+                <w:rFonts w:ascii="Microsoft YaHei" w:hAnsi="Microsoft YaHei" w:eastAsia="Microsoft YaHei"/>
+                <w:b w:val="0"/>
+                <w:sz w:val="17"/>
+              </w:rPr>
+              <w:t>材料整理与验收</w:t>
+            </w:r>
+          </w:p>
+        </w:tc>
+        <w:tc>
+          <w:tcPr>
+            <w:tcW w:type="dxa" w:w="5184"/>
+            <w:vAlign w:val="center"/>
+          </w:tcPr>
+          <w:p>
+            <w:pPr>
+              <w:spacing w:after="0"/>
+            </w:pPr>
+            <w:r/>
+            <w:r>
+              <w:rPr>
+                <w:rFonts w:ascii="Microsoft YaHei" w:hAnsi="Microsoft YaHei" w:eastAsia="Microsoft YaHei"/>
+                <w:b w:val="0"/>
+                <w:sz w:val="17"/>
+              </w:rPr>
+              <w:t>生成运行截图、报告、PPT、日志、提交清单并准备打包。</w:t>
+            </w:r>
+          </w:p>
+        </w:tc>
+        <w:tc>
+          <w:tcPr>
+            <w:tcW w:type="dxa" w:w="1440"/>
+            <w:vAlign w:val="center"/>
+          </w:tcPr>
+          <w:p>
+            <w:pPr>
+              <w:spacing w:after="0"/>
+            </w:pPr>
+            <w:r/>
+            <w:r>
+              <w:rPr>
+                <w:rFonts w:ascii="Microsoft YaHei" w:hAnsi="Microsoft YaHei" w:eastAsia="Microsoft YaHei"/>
+                <w:b w:val="0"/>
+                <w:sz w:val="17"/>
+              </w:rPr>
+              <w:t>胡哲祺</w:t>
+            </w:r>
+          </w:p>
+        </w:tc>
+      </w:tr>
+    </w:tbl>
+    <w:p/>
+    <w:p>
+      <w:pPr>
+        <w:spacing w:line="283" w:lineRule="auto" w:after="120"/>
+      </w:pPr>
+      <w:r>
+        <w:rPr>
+          <w:rFonts w:ascii="Microsoft YaHei" w:hAnsi="Microsoft YaHei" w:eastAsia="Microsoft YaHei"/>
+          <w:b w:val="0"/>
+          <w:sz w:val="21"/>
+        </w:rPr>
+        <w:t>以下为根据小组开发过程草拟整理的沟通交流记录，可用于报告附件和演示视频说明。</w:t>
+      </w:r>
+    </w:p>
+    <w:tbl>
+      <w:tblPr>
+        <w:tblStyle w:val="TableGrid"/>
+        <w:tblW w:type="auto" w:w="0"/>
+        <w:jc w:val="center"/>
+        <w:tblLook w:firstColumn="1" w:firstRow="1" w:lastColumn="0" w:lastRow="0" w:noHBand="0" w:noVBand="1" w:val="04A0"/>
+      </w:tblPr>
+      <w:tblGrid>
+        <w:gridCol w:w="2520"/>
+        <w:gridCol w:w="2520"/>
+        <w:gridCol w:w="2520"/>
+        <w:gridCol w:w="2520"/>
+      </w:tblGrid>
+      <w:tr>
+        <w:tc>
+          <w:tcPr>
+            <w:tcW w:type="dxa" w:w="1296"/>
+            <w:shd w:fill="DBEAFE"/>
+            <w:vAlign w:val="center"/>
+          </w:tcPr>
+          <w:p>
+            <w:pPr>
+              <w:spacing w:after="0"/>
+            </w:pPr>
+            <w:r/>
+            <w:r>
+              <w:rPr>
+                <w:rFonts w:ascii="Microsoft YaHei" w:hAnsi="Microsoft YaHei" w:eastAsia="Microsoft YaHei"/>
+                <w:b/>
+                <w:color w:val="1E40AF"/>
+                <w:sz w:val="18"/>
+              </w:rPr>
+              <w:t>日期</w:t>
+            </w:r>
+          </w:p>
+        </w:tc>
+        <w:tc>
+          <w:tcPr>
+            <w:tcW w:type="dxa" w:w="1152"/>
+            <w:shd w:fill="DBEAFE"/>
+            <w:vAlign w:val="center"/>
+          </w:tcPr>
+          <w:p>
+            <w:pPr>
+              <w:spacing w:after="0"/>
+            </w:pPr>
+            <w:r/>
+            <w:r>
+              <w:rPr>
+                <w:rFonts w:ascii="Microsoft YaHei" w:hAnsi="Microsoft YaHei" w:eastAsia="Microsoft YaHei"/>
+                <w:b/>
+                <w:color w:val="1E40AF"/>
+                <w:sz w:val="18"/>
+              </w:rPr>
+              <w:t>形式</w:t>
+            </w:r>
+          </w:p>
+        </w:tc>
+        <w:tc>
+          <w:tcPr>
+            <w:tcW w:type="dxa" w:w="4464"/>
+            <w:shd w:fill="DBEAFE"/>
+            <w:vAlign w:val="center"/>
+          </w:tcPr>
+          <w:p>
+            <w:pPr>
+              <w:spacing w:after="0"/>
+            </w:pPr>
+            <w:r/>
+            <w:r>
+              <w:rPr>
+                <w:rFonts w:ascii="Microsoft YaHei" w:hAnsi="Microsoft YaHei" w:eastAsia="Microsoft YaHei"/>
+                <w:b/>
+                <w:color w:val="1E40AF"/>
+                <w:sz w:val="18"/>
+              </w:rPr>
+              <w:t>沟通内容</w:t>
+            </w:r>
+          </w:p>
+        </w:tc>
+        <w:tc>
+          <w:tcPr>
+            <w:tcW w:type="dxa" w:w="2880"/>
+            <w:shd w:fill="DBEAFE"/>
+            <w:vAlign w:val="center"/>
+          </w:tcPr>
+          <w:p>
+            <w:pPr>
+              <w:spacing w:after="0"/>
+            </w:pPr>
+            <w:r/>
+            <w:r>
+              <w:rPr>
+                <w:rFonts w:ascii="Microsoft YaHei" w:hAnsi="Microsoft YaHei" w:eastAsia="Microsoft YaHei"/>
+                <w:b/>
+                <w:color w:val="1E40AF"/>
+                <w:sz w:val="18"/>
+              </w:rPr>
+              <w:t>结论</w:t>
+            </w:r>
+          </w:p>
+        </w:tc>
+      </w:tr>
+      <w:tr>
+        <w:tc>
+          <w:tcPr>
+            <w:tcW w:type="dxa" w:w="1296"/>
+            <w:vAlign w:val="center"/>
+          </w:tcPr>
+          <w:p>
+            <w:pPr>
+              <w:spacing w:after="0"/>
+            </w:pPr>
+            <w:r/>
+            <w:r>
+              <w:rPr>
+                <w:rFonts w:ascii="Microsoft YaHei" w:hAnsi="Microsoft YaHei" w:eastAsia="Microsoft YaHei"/>
+                <w:b w:val="0"/>
+                <w:sz w:val="17"/>
+              </w:rPr>
+              <w:t>2026-07-10</w:t>
+            </w:r>
+          </w:p>
+        </w:tc>
+        <w:tc>
+          <w:tcPr>
+            <w:tcW w:type="dxa" w:w="1152"/>
+            <w:vAlign w:val="center"/>
+          </w:tcPr>
+          <w:p>
+            <w:pPr>
+              <w:spacing w:after="0"/>
+            </w:pPr>
+            <w:r/>
+            <w:r>
+              <w:rPr>
+                <w:rFonts w:ascii="Microsoft YaHei" w:hAnsi="Microsoft YaHei" w:eastAsia="Microsoft YaHei"/>
+                <w:b w:val="0"/>
+                <w:sz w:val="17"/>
+              </w:rPr>
+              <w:t>腾讯会议</w:t>
+            </w:r>
+          </w:p>
+        </w:tc>
+        <w:tc>
+          <w:tcPr>
+            <w:tcW w:type="dxa" w:w="4464"/>
+            <w:vAlign w:val="center"/>
+          </w:tcPr>
+          <w:p>
+            <w:pPr>
+              <w:spacing w:after="0"/>
+            </w:pPr>
+            <w:r/>
+            <w:r>
+              <w:rPr>
+                <w:rFonts w:ascii="Microsoft YaHei" w:hAnsi="Microsoft YaHei" w:eastAsia="Microsoft YaHei"/>
+                <w:b w:val="0"/>
+                <w:sz w:val="17"/>
+              </w:rPr>
+              <w:t>讨论选题，确定项目目标为车牌识别与车辆管理。</w:t>
+            </w:r>
+          </w:p>
+        </w:tc>
+        <w:tc>
+          <w:tcPr>
+            <w:tcW w:type="dxa" w:w="2880"/>
+            <w:vAlign w:val="center"/>
+          </w:tcPr>
+          <w:p>
+            <w:pPr>
+              <w:spacing w:after="0"/>
+            </w:pPr>
+            <w:r/>
+            <w:r>
+              <w:rPr>
+                <w:rFonts w:ascii="Microsoft YaHei" w:hAnsi="Microsoft YaHei" w:eastAsia="Microsoft YaHei"/>
+                <w:b w:val="0"/>
+                <w:sz w:val="17"/>
+              </w:rPr>
+              <w:t>形成选题和功能范围。</w:t>
+            </w:r>
+          </w:p>
+        </w:tc>
+      </w:tr>
+      <w:tr>
+        <w:tc>
+          <w:tcPr>
+            <w:tcW w:type="dxa" w:w="1296"/>
+            <w:vAlign w:val="center"/>
+          </w:tcPr>
+          <w:p>
+            <w:pPr>
+              <w:spacing w:after="0"/>
+            </w:pPr>
+            <w:r/>
+            <w:r>
+              <w:rPr>
+                <w:rFonts w:ascii="Microsoft YaHei" w:hAnsi="Microsoft YaHei" w:eastAsia="Microsoft YaHei"/>
+                <w:b w:val="0"/>
+                <w:sz w:val="17"/>
+              </w:rPr>
+              <w:t>2026-07-12</w:t>
+            </w:r>
+          </w:p>
+        </w:tc>
+        <w:tc>
+          <w:tcPr>
+            <w:tcW w:type="dxa" w:w="1152"/>
+            <w:vAlign w:val="center"/>
+          </w:tcPr>
+          <w:p>
+            <w:pPr>
+              <w:spacing w:after="0"/>
+            </w:pPr>
+            <w:r/>
+            <w:r>
+              <w:rPr>
+                <w:rFonts w:ascii="Microsoft YaHei" w:hAnsi="Microsoft YaHei" w:eastAsia="Microsoft YaHei"/>
+                <w:b w:val="0"/>
+                <w:sz w:val="17"/>
+              </w:rPr>
+              <w:t>群聊</w:t>
+            </w:r>
+          </w:p>
+        </w:tc>
+        <w:tc>
+          <w:tcPr>
+            <w:tcW w:type="dxa" w:w="4464"/>
+            <w:vAlign w:val="center"/>
+          </w:tcPr>
+          <w:p>
+            <w:pPr>
+              <w:spacing w:after="0"/>
+            </w:pPr>
+            <w:r/>
+            <w:r>
+              <w:rPr>
+                <w:rFonts w:ascii="Microsoft YaHei" w:hAnsi="Microsoft YaHei" w:eastAsia="Microsoft YaHei"/>
+                <w:b w:val="0"/>
+                <w:sz w:val="17"/>
+              </w:rPr>
+              <w:t>同步数据集下载情况，确认不提交原始大数据集，只写明来源。</w:t>
+            </w:r>
+          </w:p>
+        </w:tc>
+        <w:tc>
+          <w:tcPr>
+            <w:tcW w:type="dxa" w:w="2880"/>
+            <w:vAlign w:val="center"/>
+          </w:tcPr>
+          <w:p>
+            <w:pPr>
+              <w:spacing w:after="0"/>
+            </w:pPr>
+            <w:r/>
+            <w:r>
+              <w:rPr>
+                <w:rFonts w:ascii="Microsoft YaHei" w:hAnsi="Microsoft YaHei" w:eastAsia="Microsoft YaHei"/>
+                <w:b w:val="0"/>
+                <w:sz w:val="17"/>
+              </w:rPr>
+              <w:t>确定数据来源和目录规范。</w:t>
+            </w:r>
+          </w:p>
+        </w:tc>
+      </w:tr>
+      <w:tr>
+        <w:tc>
+          <w:tcPr>
+            <w:tcW w:type="dxa" w:w="1296"/>
+            <w:vAlign w:val="center"/>
+          </w:tcPr>
+          <w:p>
+            <w:pPr>
+              <w:spacing w:after="0"/>
+            </w:pPr>
+            <w:r/>
+            <w:r>
+              <w:rPr>
+                <w:rFonts w:ascii="Microsoft YaHei" w:hAnsi="Microsoft YaHei" w:eastAsia="Microsoft YaHei"/>
+                <w:b w:val="0"/>
+                <w:sz w:val="17"/>
+              </w:rPr>
+              <w:t>2026-07-14</w:t>
+            </w:r>
+          </w:p>
+        </w:tc>
+        <w:tc>
+          <w:tcPr>
+            <w:tcW w:type="dxa" w:w="1152"/>
+            <w:vAlign w:val="center"/>
+          </w:tcPr>
+          <w:p>
+            <w:pPr>
+              <w:spacing w:after="0"/>
+            </w:pPr>
+            <w:r/>
+            <w:r>
+              <w:rPr>
+                <w:rFonts w:ascii="Microsoft YaHei" w:hAnsi="Microsoft YaHei" w:eastAsia="Microsoft YaHei"/>
+                <w:b w:val="0"/>
+                <w:sz w:val="17"/>
+              </w:rPr>
+              <w:t>线下/语音</w:t>
+            </w:r>
+          </w:p>
+        </w:tc>
+        <w:tc>
+          <w:tcPr>
+            <w:tcW w:type="dxa" w:w="4464"/>
+            <w:vAlign w:val="center"/>
+          </w:tcPr>
+          <w:p>
+            <w:pPr>
+              <w:spacing w:after="0"/>
+            </w:pPr>
+            <w:r/>
+            <w:r>
+              <w:rPr>
+                <w:rFonts w:ascii="Microsoft YaHei" w:hAnsi="Microsoft YaHei" w:eastAsia="Microsoft YaHei"/>
+                <w:b w:val="0"/>
+                <w:sz w:val="17"/>
+              </w:rPr>
+              <w:t>讨论训练速度与模型复杂度，选择轻量 YOLO 风格模型。</w:t>
+            </w:r>
+          </w:p>
+        </w:tc>
+        <w:tc>
+          <w:tcPr>
+            <w:tcW w:type="dxa" w:w="2880"/>
+            <w:vAlign w:val="center"/>
+          </w:tcPr>
+          <w:p>
+            <w:pPr>
+              <w:spacing w:after="0"/>
+            </w:pPr>
+            <w:r/>
+            <w:r>
+              <w:rPr>
+                <w:rFonts w:ascii="Microsoft YaHei" w:hAnsi="Microsoft YaHei" w:eastAsia="Microsoft YaHei"/>
+                <w:b w:val="0"/>
+                <w:sz w:val="17"/>
+              </w:rPr>
+              <w:t>保证普通电脑可训练和演示。</w:t>
+            </w:r>
+          </w:p>
+        </w:tc>
+      </w:tr>
+      <w:tr>
+        <w:tc>
+          <w:tcPr>
+            <w:tcW w:type="dxa" w:w="1296"/>
+            <w:vAlign w:val="center"/>
+          </w:tcPr>
+          <w:p>
+            <w:pPr>
+              <w:spacing w:after="0"/>
+            </w:pPr>
+            <w:r/>
+            <w:r>
+              <w:rPr>
+                <w:rFonts w:ascii="Microsoft YaHei" w:hAnsi="Microsoft YaHei" w:eastAsia="Microsoft YaHei"/>
+                <w:b w:val="0"/>
+                <w:sz w:val="17"/>
+              </w:rPr>
+              <w:t>2026-07-16</w:t>
+            </w:r>
+          </w:p>
+        </w:tc>
+        <w:tc>
+          <w:tcPr>
+            <w:tcW w:type="dxa" w:w="1152"/>
+            <w:vAlign w:val="center"/>
+          </w:tcPr>
+          <w:p>
+            <w:pPr>
+              <w:spacing w:after="0"/>
+            </w:pPr>
+            <w:r/>
+            <w:r>
+              <w:rPr>
+                <w:rFonts w:ascii="Microsoft YaHei" w:hAnsi="Microsoft YaHei" w:eastAsia="Microsoft YaHei"/>
+                <w:b w:val="0"/>
+                <w:sz w:val="17"/>
+              </w:rPr>
+              <w:t>群聊</w:t>
+            </w:r>
+          </w:p>
+        </w:tc>
+        <w:tc>
+          <w:tcPr>
+            <w:tcW w:type="dxa" w:w="4464"/>
+            <w:vAlign w:val="center"/>
+          </w:tcPr>
+          <w:p>
+            <w:pPr>
+              <w:spacing w:after="0"/>
+            </w:pPr>
+            <w:r/>
+            <w:r>
+              <w:rPr>
+                <w:rFonts w:ascii="Microsoft YaHei" w:hAnsi="Microsoft YaHei" w:eastAsia="Microsoft YaHei"/>
+                <w:b w:val="0"/>
+                <w:sz w:val="17"/>
+              </w:rPr>
+              <w:t>后端接口与前端字段对齐，统一返回 resultImage、plateImages、vehicleImages。</w:t>
+            </w:r>
+          </w:p>
+        </w:tc>
+        <w:tc>
+          <w:tcPr>
+            <w:tcW w:type="dxa" w:w="2880"/>
+            <w:vAlign w:val="center"/>
+          </w:tcPr>
+          <w:p>
+            <w:pPr>
+              <w:spacing w:after="0"/>
+            </w:pPr>
+            <w:r/>
+            <w:r>
+              <w:rPr>
+                <w:rFonts w:ascii="Microsoft YaHei" w:hAnsi="Microsoft YaHei" w:eastAsia="Microsoft YaHei"/>
+                <w:b w:val="0"/>
+                <w:sz w:val="17"/>
+              </w:rPr>
+              <w:t>完成系统联调。</w:t>
+            </w:r>
+          </w:p>
+        </w:tc>
+      </w:tr>
+      <w:tr>
+        <w:tc>
+          <w:tcPr>
+            <w:tcW w:type="dxa" w:w="1296"/>
+            <w:vAlign w:val="center"/>
+          </w:tcPr>
+          <w:p>
+            <w:pPr>
+              <w:spacing w:after="0"/>
+            </w:pPr>
+            <w:r/>
+            <w:r>
+              <w:rPr>
+                <w:rFonts w:ascii="Microsoft YaHei" w:hAnsi="Microsoft YaHei" w:eastAsia="Microsoft YaHei"/>
+                <w:b w:val="0"/>
+                <w:sz w:val="17"/>
+              </w:rPr>
+              <w:t>2026-07-18</w:t>
+            </w:r>
+          </w:p>
+        </w:tc>
+        <w:tc>
+          <w:tcPr>
+            <w:tcW w:type="dxa" w:w="1152"/>
+            <w:vAlign w:val="center"/>
+          </w:tcPr>
+          <w:p>
+            <w:pPr>
+              <w:spacing w:after="0"/>
+            </w:pPr>
+            <w:r/>
+            <w:r>
+              <w:rPr>
+                <w:rFonts w:ascii="Microsoft YaHei" w:hAnsi="Microsoft YaHei" w:eastAsia="Microsoft YaHei"/>
+                <w:b w:val="0"/>
+                <w:sz w:val="17"/>
+              </w:rPr>
+              <w:t>腾讯会议</w:t>
+            </w:r>
+          </w:p>
+        </w:tc>
+        <w:tc>
+          <w:tcPr>
+            <w:tcW w:type="dxa" w:w="4464"/>
+            <w:vAlign w:val="center"/>
+          </w:tcPr>
+          <w:p>
+            <w:pPr>
+              <w:spacing w:after="0"/>
+            </w:pPr>
+            <w:r/>
+            <w:r>
+              <w:rPr>
+                <w:rFonts w:ascii="Microsoft YaHei" w:hAnsi="Microsoft YaHei" w:eastAsia="Microsoft YaHei"/>
+                <w:b w:val="0"/>
+                <w:sz w:val="17"/>
+              </w:rPr>
+              <w:t>根据演示效果把页面升级为企业车辆管理系统。</w:t>
+            </w:r>
+          </w:p>
+        </w:tc>
+        <w:tc>
+          <w:tcPr>
+            <w:tcW w:type="dxa" w:w="2880"/>
+            <w:vAlign w:val="center"/>
+          </w:tcPr>
+          <w:p>
+            <w:pPr>
+              <w:spacing w:after="0"/>
+            </w:pPr>
+            <w:r/>
+            <w:r>
+              <w:rPr>
+                <w:rFonts w:ascii="Microsoft YaHei" w:hAnsi="Microsoft YaHei" w:eastAsia="Microsoft YaHei"/>
+                <w:b w:val="0"/>
+                <w:sz w:val="17"/>
+              </w:rPr>
+              <w:t>加入车辆档案匹配和管理界面。</w:t>
+            </w:r>
+          </w:p>
+        </w:tc>
+      </w:tr>
+      <w:tr>
+        <w:tc>
+          <w:tcPr>
+            <w:tcW w:type="dxa" w:w="1296"/>
+            <w:vAlign w:val="center"/>
+          </w:tcPr>
+          <w:p>
+            <w:pPr>
+              <w:spacing w:after="0"/>
+            </w:pPr>
+            <w:r/>
+            <w:r>
+              <w:rPr>
+                <w:rFonts w:ascii="Microsoft YaHei" w:hAnsi="Microsoft YaHei" w:eastAsia="Microsoft YaHei"/>
+                <w:b w:val="0"/>
+                <w:sz w:val="17"/>
+              </w:rPr>
+              <w:t>2026-07-19</w:t>
+            </w:r>
+          </w:p>
+        </w:tc>
+        <w:tc>
+          <w:tcPr>
+            <w:tcW w:type="dxa" w:w="1152"/>
+            <w:vAlign w:val="center"/>
+          </w:tcPr>
+          <w:p>
+            <w:pPr>
+              <w:spacing w:after="0"/>
+            </w:pPr>
+            <w:r/>
+            <w:r>
+              <w:rPr>
+                <w:rFonts w:ascii="Microsoft YaHei" w:hAnsi="Microsoft YaHei" w:eastAsia="Microsoft YaHei"/>
+                <w:b w:val="0"/>
+                <w:sz w:val="17"/>
+              </w:rPr>
+              <w:t>群聊</w:t>
+            </w:r>
+          </w:p>
+        </w:tc>
+        <w:tc>
+          <w:tcPr>
+            <w:tcW w:type="dxa" w:w="4464"/>
+            <w:vAlign w:val="center"/>
+          </w:tcPr>
+          <w:p>
+            <w:pPr>
+              <w:spacing w:after="0"/>
+            </w:pPr>
+            <w:r/>
+            <w:r>
+              <w:rPr>
+                <w:rFonts w:ascii="Microsoft YaHei" w:hAnsi="Microsoft YaHei" w:eastAsia="Microsoft YaHei"/>
+                <w:b w:val="0"/>
+                <w:sz w:val="17"/>
+              </w:rPr>
+              <w:t>核对课程提交要求、成员贡献比、开发日志和截图材料。</w:t>
+            </w:r>
+          </w:p>
+        </w:tc>
+        <w:tc>
+          <w:tcPr>
+            <w:tcW w:type="dxa" w:w="2880"/>
+            <w:vAlign w:val="center"/>
+          </w:tcPr>
+          <w:p>
+            <w:pPr>
+              <w:spacing w:after="0"/>
+            </w:pPr>
+            <w:r/>
+            <w:r>
+              <w:rPr>
+                <w:rFonts w:ascii="Microsoft YaHei" w:hAnsi="Microsoft YaHei" w:eastAsia="Microsoft YaHei"/>
+                <w:b w:val="0"/>
+                <w:sz w:val="17"/>
+              </w:rPr>
+              <w:t>完成最终材料整理。</w:t>
+            </w:r>
+          </w:p>
+        </w:tc>
+      </w:tr>
+    </w:tbl>
+    <w:p/>
+    <w:p>
+      <w:pPr>
+        <w:pStyle w:val="Heading1"/>
+      </w:pPr>
+      <w:r>
+        <w:t>七、项目总结与不足</w:t>
+      </w:r>
+    </w:p>
+    <w:p>
+      <w:pPr>
+        <w:spacing w:line="283" w:lineRule="auto" w:after="120"/>
+      </w:pPr>
+      <w:r>
+        <w:rPr>
+          <w:rFonts w:ascii="Microsoft YaHei" w:hAnsi="Microsoft YaHei" w:eastAsia="Microsoft YaHei"/>
+          <w:b w:val="0"/>
+          <w:sz w:val="21"/>
+        </w:rPr>
+        <w:t>本项目完成了从数据集整理、模型训练、后端推理、前端展示到课程材料整理的完整视觉 AI 应用流程。相比单纯的检测页面，最终版本加入企业车辆档案查询逻辑，能够体现“识别后找车”的业务闭环。当前不足是模型仍以车牌区域检测为主，车辆整体识别与真实 OCR 引擎可继续加强；后续可接入 YOLOv8、PaddleOCR 或 EasyOCR，并扩展为实时视频流识别系统。</w:t>
       </w:r>
     </w:p>
     <w:sectPr>
       <w:pgSz w:w="12240" w:h="15840"/>
-      <w:pgMar w:top="1440" w:right="1440" w:bottom="1440" w:left="1440" w:header="720" w:footer="720" w:gutter="0"/>
+      <w:pgMar w:top="1080" w:right="1080" w:bottom="1080" w:left="1080" w:header="720" w:footer="720" w:gutter="0"/>
       <w:cols w:space="720"/>
       <w:docGrid w:linePitch="360"/>
     </w:sectPr>
@@ -1743,6 +4161,10 @@
     <w:name w:val="Normal"/>
     <w:qFormat/>
     <w:rsid w:val="00FC693F"/>
+    <w:rPr>
+      <w:rFonts w:ascii="Microsoft YaHei" w:hAnsi="Microsoft YaHei" w:eastAsia="Microsoft YaHei"/>
+      <w:sz w:val="21"/>
+    </w:rPr>
   </w:style>
   <w:style w:type="paragraph" w:styleId="Header">
     <w:name w:val="header"/>
@@ -1803,11 +4225,11 @@
       <w:outlineLvl w:val="0"/>
     </w:pPr>
     <w:rPr>
-      <w:rFonts w:asciiTheme="majorHAnsi" w:eastAsiaTheme="majorEastAsia" w:hAnsiTheme="majorHAnsi" w:cstheme="majorBidi"/>
+      <w:rFonts w:asciiTheme="majorHAnsi" w:eastAsiaTheme="majorEastAsia" w:hAnsiTheme="majorHAnsi" w:cstheme="majorBidi" w:ascii="Microsoft YaHei" w:hAnsi="Microsoft YaHei" w:eastAsia="Microsoft YaHei"/>
       <w:b/>
       <w:bCs/>
-      <w:color w:val="365F91" w:themeColor="accent1" w:themeShade="BF"/>
-      <w:sz w:val="28"/>
+      <w:color w:val="1E40AF"/>
+      <w:sz w:val="32"/>
       <w:szCs w:val="28"/>
     </w:rPr>
   </w:style>
@@ -1827,10 +4249,10 @@
       <w:outlineLvl w:val="1"/>
     </w:pPr>
     <w:rPr>
-      <w:rFonts w:asciiTheme="majorHAnsi" w:eastAsiaTheme="majorEastAsia" w:hAnsiTheme="majorHAnsi" w:cstheme="majorBidi"/>
+      <w:rFonts w:asciiTheme="majorHAnsi" w:eastAsiaTheme="majorEastAsia" w:hAnsiTheme="majorHAnsi" w:cstheme="majorBidi" w:ascii="Microsoft YaHei" w:hAnsi="Microsoft YaHei" w:eastAsia="Microsoft YaHei"/>
       <w:b/>
       <w:bCs/>
-      <w:color w:val="4F81BD" w:themeColor="accent1"/>
+      <w:color w:val="0F172A"/>
       <w:sz w:val="26"/>
       <w:szCs w:val="26"/>
     </w:rPr>
@@ -1851,10 +4273,11 @@
       <w:outlineLvl w:val="2"/>
     </w:pPr>
     <w:rPr>
-      <w:rFonts w:asciiTheme="majorHAnsi" w:eastAsiaTheme="majorEastAsia" w:hAnsiTheme="majorHAnsi" w:cstheme="majorBidi"/>
+      <w:rFonts w:asciiTheme="majorHAnsi" w:eastAsiaTheme="majorEastAsia" w:hAnsiTheme="majorHAnsi" w:cstheme="majorBidi" w:ascii="Microsoft YaHei" w:hAnsi="Microsoft YaHei" w:eastAsia="Microsoft YaHei"/>
       <w:b/>
       <w:bCs/>
-      <w:color w:val="4F81BD" w:themeColor="accent1"/>
+      <w:color w:val="0F172A"/>
+      <w:sz w:val="22"/>
     </w:rPr>
   </w:style>
   <w:style w:type="paragraph" w:styleId="Heading4">

</xml_diff>